<commit_message>
feat: update similarity thresholds and enhance article anchoring logic for improved comparison accuracy
</commit_message>
<xml_diff>
--- a/data/document/pair 2/Thỏa Thuận Cổ Đông Về Góp Vốn và Liên Doanh (phát triển Khu du lịch - Resort)_V2.docx
+++ b/data/document/pair 2/Thỏa Thuận Cổ Đông Về Góp Vốn và Liên Doanh (phát triển Khu du lịch - Resort)_V2.docx
@@ -436,6 +436,11 @@
           <w:szCs w:val="24"/>
         </w:rPr>
         <w:t xml:space="preserve"> </w:t>
+      </w:r>
+      <w:r>
+        <w:rPr>
+          <w:szCs w:val="24"/>
+        </w:rPr>
         <w:tab/>
         <w:t xml:space="preserve">Các bên góp vốn sẽ thành lập Công ty TNHH Khu Du Lịch Biển Ngọc Nha Trang (“Công ty”), do Bên A sở hữu </w:t>
       </w:r>
@@ -574,6 +579,11 @@
           <w:szCs w:val="24"/>
         </w:rPr>
         <w:t>(B)</w:t>
+      </w:r>
+      <w:r>
+        <w:rPr>
+          <w:szCs w:val="24"/>
+        </w:rPr>
         <w:tab/>
         <w:t>K</w:t>
       </w:r>
@@ -755,6 +765,11 @@
           <w:lang w:val="en-GB"/>
         </w:rPr>
         <w:t xml:space="preserve">nghĩa là hội đồng gồm các đại diện cho các bên góp vốn của Công ty (“Hội đồng thành viên”), có thẩm quyền cao nhất theo luật doanh nghiệp trong việc điều hành và quản lý kinh doanh Công ty, và trong việc chỉ đạo Ban Đại Diện HĐTV công ty điều hành kinh doanh hàng ngày. Các bên có thể đơn phương chỉ định một Đại Diện Độc Lập tham gia vào hội đồng theo từng thời </w:t>
+      </w:r>
+      <w:r>
+        <w:rPr>
+          <w:lang w:val="en-GB"/>
+        </w:rPr>
         <w:lastRenderedPageBreak/>
         <w:t xml:space="preserve">điểm. </w:t>
       </w:r>
@@ -1005,6 +1020,12 @@
           <w:lang w:val="en-GB"/>
         </w:rPr>
         <w:t>“Các bên góp vốn”</w:t>
+      </w:r>
+      <w:r>
+        <w:rPr>
+          <w:b/>
+          <w:lang w:val="en-GB"/>
+        </w:rPr>
         <w:tab/>
       </w:r>
       <w:r>
@@ -1551,6 +1572,12 @@
           <w:lang w:val="en-GB"/>
         </w:rPr>
         <w:tab/>
+      </w:r>
+      <w:r>
+        <w:rPr>
+          <w:szCs w:val="24"/>
+          <w:lang w:val="en-GB"/>
+        </w:rPr>
         <w:tab/>
         <w:t xml:space="preserve">Công ty sẽ có Hội đồng thành viên, Chủ tịch Hội đồng thành viên và Tổng Giám Đốc. </w:t>
       </w:r>
@@ -1588,167 +1615,315 @@
     <w:p>
       <w:pPr>
         <w:tabs>
-          <w:tab w:val="left" w:pos="142"/>
           <w:tab w:val="left" w:pos="567"/>
         </w:tabs>
-        <w:ind w:left="1440" w:hanging="1440"/>
-        <w:jc w:val="both"/>
-        <w:rPr>
-          <w:b/>
-          <w:szCs w:val="24"/>
-        </w:rPr>
-      </w:pPr>
-      <w:r>
-        <w:rPr>
-          <w:b/>
-          <w:szCs w:val="24"/>
-        </w:rPr>
-        <w:t>ĐIỀU 5BIS.</w:t>
-        <w:tab/>
-      </w:r>
-      <w:bookmarkStart w:id="2" w:name="_Toc416154526"/>
-      <w:bookmarkStart w:id="3" w:name="_Toc489709528"/>
-      <w:bookmarkStart w:id="4" w:name="_Ref25721985"/>
-      <w:bookmarkStart w:id="5" w:name="_Ref25722020"/>
-      <w:bookmarkStart w:id="6" w:name="_Ref27830078"/>
-      <w:bookmarkStart w:id="7" w:name="_Toc489709526"/>
-      <w:bookmarkStart w:id="8" w:name="_Ref25720646"/>
-      <w:bookmarkStart w:id="9" w:name="_Toc31543538"/>
+        <w:jc w:val="both"/>
+        <w:rPr>
+          <w:szCs w:val="24"/>
+        </w:rPr>
+      </w:pPr>
+      <w:bookmarkStart w:id="2" w:name="_Toc489709526"/>
+      <w:bookmarkStart w:id="3" w:name="_Ref25720646"/>
+      <w:bookmarkStart w:id="4" w:name="_Toc31543538"/>
       <w:bookmarkEnd w:id="0"/>
       <w:bookmarkEnd w:id="1"/>
-      <w:r>
+    </w:p>
+    <w:p>
+      <w:pPr>
+        <w:pStyle w:val="Heading1"/>
+        <w:spacing w:after="0"/>
+      </w:pPr>
+      <w:r>
+        <w:t>Điều lệ công ty, Hội Đồng Thành Viên và tiến trình ra quyết định của Công ty</w:t>
+      </w:r>
+    </w:p>
+    <w:p>
+      <w:pPr>
+        <w:tabs>
+          <w:tab w:val="left" w:pos="567"/>
+        </w:tabs>
+        <w:ind w:left="567" w:hanging="567"/>
+        <w:jc w:val="both"/>
+        <w:rPr>
+          <w:szCs w:val="24"/>
+        </w:rPr>
+      </w:pPr>
+    </w:p>
+    <w:p>
+      <w:pPr>
+        <w:pStyle w:val="Heading2"/>
+      </w:pPr>
+      <w:r>
+        <w:t>Sau khi ký hợp đồng này, các bên sẽ ký duyệt điều lệ và các tài liệu thành lập công ty phù hợp với các nguyên tắc của hợp đồng này và qui định của luật doanh nghiệp;</w:t>
+      </w:r>
+    </w:p>
+    <w:p>
+      <w:pPr>
+        <w:tabs>
+          <w:tab w:val="left" w:pos="567"/>
+        </w:tabs>
+        <w:ind w:left="567" w:hanging="567"/>
+        <w:jc w:val="both"/>
+        <w:rPr>
+          <w:szCs w:val="24"/>
+        </w:rPr>
+      </w:pPr>
+    </w:p>
+    <w:p>
+      <w:pPr>
+        <w:pStyle w:val="Heading2"/>
+      </w:pPr>
+      <w:r>
+        <w:t xml:space="preserve">Ngoại trừ các “Vấn Đề Quan Trọng”,  cả các quyết định của Hội đồng thành viên sẽ được thông qua bằng việc bỏ phiếu, nghị quyết hoặc ưng thuận bởi bên góp vốn sở hữu trên 65% giá trị danh nghĩa của phần vốn góp có mặt và bỏ phiếu trực tiếp hoặc uỷ quyền hoặc cử đại diện công ty tại cuộc họp xem xét vấn đề đó miễn là luôn có một số đại biểu tối thiểu yêu cầu có mặt trong cuộc họp. </w:t>
+      </w:r>
+    </w:p>
+    <w:p>
+      <w:pPr>
+        <w:tabs>
+          <w:tab w:val="left" w:pos="567"/>
+        </w:tabs>
+        <w:ind w:left="567" w:hanging="567"/>
+        <w:jc w:val="both"/>
+        <w:rPr>
+          <w:szCs w:val="24"/>
+        </w:rPr>
+      </w:pPr>
+    </w:p>
+    <w:p>
+      <w:pPr>
+        <w:pStyle w:val="Heading2"/>
+      </w:pPr>
+      <w:r>
+        <w:t xml:space="preserve">Cuộc họp Hội đồng thành viên sẽ thông qua các quyết định trong thẩm quyền bằng biểu quyết bỏ phiếu trong các cuộc họp hoặc lấy ý kiến bằng văn bản, miền là việc bỏ phiếu về bất cứ “Vấn đề quan trọng” nào sẽ chỉ được tiến hành qua tổ chức họp trực tiếp thực tế. </w:t>
+      </w:r>
+    </w:p>
+    <w:p>
+      <w:pPr>
+        <w:tabs>
+          <w:tab w:val="left" w:pos="567"/>
+        </w:tabs>
+        <w:ind w:left="567" w:hanging="567"/>
+        <w:jc w:val="both"/>
+        <w:rPr>
+          <w:szCs w:val="24"/>
+        </w:rPr>
+      </w:pPr>
+    </w:p>
+    <w:p>
+      <w:pPr>
+        <w:pStyle w:val="Heading2"/>
+      </w:pPr>
+      <w:r>
+        <w:t xml:space="preserve">Ngoại trừ các “ Vấn Đề Quan Trọng”, bất cứ quyết định nào của  Hội đồng thành viên sẽ được thông qua không cần tổ chức họp trực tiếp nếu có văn bản đề nghị được thông báo và được duyệt bằng văn bản của  đại diện bên nắm giữ ít nhất </w:t>
+      </w:r>
+      <w:r>
+        <w:rPr>
+          <w:rStyle w:val="normalchar1"/>
+        </w:rPr>
+        <w:t>65</w:t>
+      </w:r>
+      <w:r>
+        <w:t xml:space="preserve">% vốn điều lệ Công ty. </w:t>
+      </w:r>
+    </w:p>
+    <w:p>
+      <w:pPr>
+        <w:tabs>
+          <w:tab w:val="left" w:pos="567"/>
+        </w:tabs>
+        <w:ind w:left="567" w:hanging="567"/>
+        <w:jc w:val="both"/>
+        <w:rPr>
+          <w:szCs w:val="24"/>
+        </w:rPr>
+      </w:pPr>
+    </w:p>
+    <w:p>
+      <w:pPr>
+        <w:pStyle w:val="Heading2"/>
+      </w:pPr>
+      <w:r>
+        <w:t>Ban Giám Đốc</w:t>
+      </w:r>
+    </w:p>
+    <w:p>
+      <w:pPr>
+        <w:tabs>
+          <w:tab w:val="left" w:pos="567"/>
+        </w:tabs>
+        <w:ind w:left="567"/>
+        <w:jc w:val="both"/>
+        <w:rPr>
+          <w:szCs w:val="24"/>
+        </w:rPr>
+      </w:pPr>
+    </w:p>
+    <w:p>
+      <w:pPr>
+        <w:tabs>
+          <w:tab w:val="left" w:pos="567"/>
+        </w:tabs>
+        <w:ind w:left="720"/>
+        <w:jc w:val="both"/>
+        <w:rPr>
+          <w:szCs w:val="24"/>
+        </w:rPr>
+      </w:pPr>
+      <w:r>
+        <w:rPr>
+          <w:szCs w:val="24"/>
+        </w:rPr>
+        <w:t>Tùy thuộc theo thẩm quyền của chung của Hội Đồng Thành Viên Công Ty, Tổng Giám ĐốcCông ty và Ban Giám Đốc hoạt động dưới sự chỉ đạo của Tổng Giám Đốc sẽ có trách nhiệm  điều hành, giám sát, quản lý hoạt động hàng ngày nói chung của Công ty. Các bên đồng ý rằng các công việc hàng ngày của Công ty sẽ được quản lý bởi Tổng Giám Đốc với sự trợ giúp của Ban Giám Đốc do Tổng Giám Đốc thành lập và chỉ đạo. Một cách tổng quát, Hội đồng thành viên, sẽ không quyết định bất cứ vấn đề nào thuộc thẩm quyền điều hành của Tổng Giám Đốc.</w:t>
+      </w:r>
+    </w:p>
+    <w:p>
+      <w:pPr>
+        <w:tabs>
+          <w:tab w:val="left" w:pos="567"/>
+        </w:tabs>
+        <w:ind w:left="567"/>
+        <w:jc w:val="both"/>
+        <w:rPr>
+          <w:szCs w:val="24"/>
+        </w:rPr>
+      </w:pPr>
+    </w:p>
+    <w:p>
+      <w:pPr>
+        <w:pStyle w:val="Heading1"/>
+        <w:spacing w:after="0"/>
+      </w:pPr>
+      <w:r>
+        <w:t>Hoạt động kinh doanh của Công ty</w:t>
+      </w:r>
+    </w:p>
+    <w:p>
+      <w:pPr>
+        <w:tabs>
+          <w:tab w:val="left" w:pos="567"/>
+        </w:tabs>
+        <w:jc w:val="both"/>
         <w:rPr>
           <w:b/>
           <w:szCs w:val="24"/>
         </w:rPr>
-        <w:t>BAN GIÁM ĐỐC VÀ VIỆC ĐIỀU HÀNH HOẠT ĐỘNG HANG NGÀY CỦA CÔNG TY:</w:t>
-      </w:r>
+      </w:pPr>
+    </w:p>
+    <w:p>
+      <w:pPr>
+        <w:pStyle w:val="Heading2"/>
+      </w:pPr>
+      <w:r>
+        <w:t>Các bên đồng ý rằng hoạt động kinh doanh của Công ty là phát triển và điều hành hoạt động Khu Du Lịch Biển Ngọc Resort Nha Trang (“khu du lịch”) thành một  khu du lịch cao cấp 5 sao đạt tiêu chuẩn quốc tế.</w:t>
+      </w:r>
+    </w:p>
+    <w:p>
+      <w:pPr>
+        <w:ind w:left="720"/>
+        <w:jc w:val="both"/>
+        <w:rPr>
+          <w:szCs w:val="24"/>
+        </w:rPr>
+      </w:pPr>
+    </w:p>
+    <w:p>
+      <w:pPr>
+        <w:pStyle w:val="Heading2"/>
+      </w:pPr>
+      <w:bookmarkStart w:id="5" w:name="_Ref25720722"/>
       <w:bookmarkEnd w:id="2"/>
       <w:bookmarkEnd w:id="3"/>
       <w:bookmarkEnd w:id="4"/>
-      <w:bookmarkEnd w:id="5"/>
-      <w:bookmarkEnd w:id="6"/>
-    </w:p>
-    <w:p>
-      <w:pPr>
-        <w:tabs>
-          <w:tab w:val="left" w:pos="1440"/>
-        </w:tabs>
-        <w:ind w:left="1440" w:hanging="1440"/>
-        <w:jc w:val="both"/>
-        <w:rPr>
-          <w:szCs w:val="24"/>
-          <w:lang w:val="en-GB"/>
-        </w:rPr>
-      </w:pPr>
+      <w:r>
+        <w:t xml:space="preserve">Thông qua Hội Đồng Thành Viên, và Đại Diện Của Bên B như nói tại đây hai bên đồng ý thực hiện theo chuẩn mực quốc tế việc lập quy hoạch, thiết kế thực hiện xây dựng và phát triển dự án. </w:t>
+      </w:r>
+    </w:p>
+    <w:p/>
+    <w:p>
+      <w:pPr>
+        <w:pStyle w:val="Heading2"/>
+      </w:pPr>
+      <w:r>
+        <w:t>Các bên sẽ đảm bảo, thông qua Tổng Giám Đốc và công ty quản lý khách sạn đã chỉ định, khu du lịch sẽ mở cửa tại thời điểm sớm nhất một cách hợp lý; và khu du lịch sẽ hoạt động theo tiêu chuẩn quốc tế;</w:t>
+      </w:r>
+    </w:p>
+    <w:p>
+      <w:pPr>
+        <w:widowControl/>
+        <w:ind w:left="1080"/>
+        <w:jc w:val="both"/>
+        <w:rPr>
+          <w:szCs w:val="24"/>
+        </w:rPr>
+      </w:pPr>
+    </w:p>
+    <w:bookmarkEnd w:id="5"/>
+    <w:p>
+      <w:pPr>
+        <w:pStyle w:val="Heading2"/>
+      </w:pPr>
+      <w:r>
+        <w:t>Mỗi bên (nếu có thể làm một cách hợp pháp) đảm bảo rằng Công ty sẽ thực hiện việc kinh doanh một cách đặc biệt hơn mô tả trên, phù hợp với hợp đồng này</w:t>
+      </w:r>
     </w:p>
     <w:p>
       <w:pPr>
         <w:tabs>
           <w:tab w:val="left" w:pos="720"/>
         </w:tabs>
+        <w:ind w:left="720"/>
+        <w:jc w:val="both"/>
+        <w:rPr>
+          <w:szCs w:val="24"/>
+          <w:lang w:eastAsia="zh-TW"/>
+        </w:rPr>
+      </w:pPr>
+    </w:p>
+    <w:p>
+      <w:pPr>
+        <w:tabs>
+          <w:tab w:val="left" w:pos="720"/>
+        </w:tabs>
         <w:ind w:left="720" w:hanging="720"/>
         <w:jc w:val="both"/>
         <w:rPr>
           <w:szCs w:val="24"/>
-          <w:lang w:val="en-GB"/>
-        </w:rPr>
-      </w:pPr>
-      <w:r>
-        <w:rPr>
-          <w:szCs w:val="24"/>
-          <w:lang w:val="en-GB"/>
-        </w:rPr>
-        <w:t>5bis.1.</w:t>
-        <w:tab/>
-        <w:t>Các bên góp vốn sẽ thảo luận để đạt được nhất trí đồng ý chỉ định công ty điều hành  khách sạn;</w:t>
-      </w:r>
-    </w:p>
-    <w:p>
-      <w:pPr>
-        <w:tabs>
-          <w:tab w:val="left" w:pos="720"/>
-        </w:tabs>
-        <w:ind w:left="720" w:hanging="720"/>
-        <w:jc w:val="both"/>
-        <w:rPr>
-          <w:szCs w:val="24"/>
-          <w:lang w:val="en-GB"/>
-        </w:rPr>
-      </w:pPr>
-    </w:p>
-    <w:p>
-      <w:pPr>
-        <w:tabs>
-          <w:tab w:val="left" w:pos="720"/>
-        </w:tabs>
-        <w:ind w:left="720" w:hanging="720"/>
-        <w:jc w:val="both"/>
-        <w:rPr>
-          <w:szCs w:val="24"/>
-        </w:rPr>
-      </w:pPr>
-      <w:r>
-        <w:rPr>
-          <w:szCs w:val="24"/>
-        </w:rPr>
-        <w:t xml:space="preserve">5bis.2 </w:t>
-        <w:tab/>
-        <w:t xml:space="preserve">Tổng Giám Đốc của Công ty sẽ được HĐTV quyết định thuê hay chỉ định trên cơ sở giới thiệu của một trong hai bên góp vốn hay do công ty điều hành khách sạn giới thiệu. Tổng Giám Đốc chịu trách nhiệm quản lý hoạt động kinh doanh hàng ngày của Công ty và sẽ trực tiếp điều hành và chỉ định các nhân viên của công ty, với các chi phí do công ty chịu. </w:t>
-      </w:r>
-    </w:p>
-    <w:p>
-      <w:pPr>
-        <w:tabs>
-          <w:tab w:val="left" w:pos="720"/>
-        </w:tabs>
-        <w:ind w:left="720" w:hanging="720"/>
-        <w:jc w:val="both"/>
-        <w:rPr>
-          <w:szCs w:val="24"/>
-        </w:rPr>
-      </w:pPr>
-    </w:p>
-    <w:p>
-      <w:pPr>
-        <w:tabs>
-          <w:tab w:val="left" w:pos="720"/>
-        </w:tabs>
-        <w:ind w:left="720" w:hanging="720"/>
-        <w:jc w:val="both"/>
-        <w:rPr>
-          <w:szCs w:val="24"/>
-        </w:rPr>
-      </w:pPr>
-      <w:r>
-        <w:rPr>
-          <w:szCs w:val="24"/>
-        </w:rPr>
-        <w:t>5bis.3</w:t>
-        <w:tab/>
-        <w:t xml:space="preserve">Hội đồng Thành viên sẽ thảo luận để bổ nhiệm và miễn nhiệm Giám Đốc Tài Chính kiêm Kế Toán Trưởng của Công ty trên cơ sở đề cử của Chủ Tịch HĐTV hoặc Công </w:t>
-        <w:lastRenderedPageBreak/>
-        <w:t xml:space="preserve">Ty Quản Lý khách sạn. </w:t>
-      </w:r>
-    </w:p>
-    <w:p>
-      <w:pPr>
-        <w:tabs>
-          <w:tab w:val="left" w:pos="567"/>
-        </w:tabs>
-        <w:jc w:val="both"/>
-        <w:rPr>
-          <w:szCs w:val="24"/>
-        </w:rPr>
-      </w:pPr>
-    </w:p>
+          <w:lang w:eastAsia="zh-TW"/>
+        </w:rPr>
+      </w:pPr>
+      <w:bookmarkStart w:id="6" w:name="_Ref31129339"/>
+      <w:bookmarkStart w:id="7" w:name="_Ref31119044"/>
+    </w:p>
+    <w:bookmarkEnd w:id="6"/>
+    <w:bookmarkEnd w:id="7"/>
     <w:p>
       <w:pPr>
         <w:pStyle w:val="Heading1"/>
         <w:spacing w:after="0"/>
       </w:pPr>
       <w:r>
-        <w:t>Điều lệ công ty, Hội Đồng Thành Viên và tiến trình ra quyết định của Công ty</w:t>
+        <w:t>Các nghĩa vụ khác của các bên góp vốn</w:t>
+      </w:r>
+    </w:p>
+    <w:p>
+      <w:pPr>
+        <w:rPr>
+          <w:lang w:val="en-GB" w:eastAsia="zh-TW"/>
+        </w:rPr>
+      </w:pPr>
+    </w:p>
+    <w:p>
+      <w:pPr>
+        <w:pStyle w:val="Heading2"/>
+        <w:rPr>
+          <w:lang w:val="en-GB"/>
+        </w:rPr>
+      </w:pPr>
+      <w:r>
+        <w:rPr>
+          <w:lang w:val="en-GB"/>
+        </w:rPr>
+        <w:t xml:space="preserve">Từng bên góp vốn sẽ hỗ trợ theo khả năng của mình để Công Ty đạt được tất cả các giấy phép, phê duyệt, cho phép theo yêu cầu của luật pháp và các qui định của Việt nam được áp dụng cho hoạt động kinh doanh. </w:t>
       </w:r>
     </w:p>
     <w:p>
@@ -1760,15 +1935,22 @@
         <w:jc w:val="both"/>
         <w:rPr>
           <w:szCs w:val="24"/>
+          <w:lang w:val="en-GB"/>
         </w:rPr>
       </w:pPr>
     </w:p>
     <w:p>
       <w:pPr>
         <w:pStyle w:val="Heading2"/>
-      </w:pPr>
-      <w:r>
-        <w:t>Sau khi ký hợp đồng này, các bên sẽ ký duyệt điều lệ và các tài liệu thành lập công ty phù hợp với các nguyên tắc của hợp đồng này và qui định của luật doanh nghiệp;</w:t>
+        <w:rPr>
+          <w:lang w:val="en-GB"/>
+        </w:rPr>
+      </w:pPr>
+      <w:r>
+        <w:rPr>
+          <w:lang w:val="en-GB"/>
+        </w:rPr>
+        <w:t>Các Bên sẽ đảm bảo rằng không muộn hơn hai tháng trước khi bắt đầu năm tài chính, Tổng Giám Đốc của Công Ty sẽ chuẩn bị và gửi cho các Đại Diện HĐTV bản đề nghị kế hoạch kinh doanh và bản đề nghị ngân sách  hàng năm cho năm tài chính tiếp theo.</w:t>
       </w:r>
     </w:p>
     <w:p>
@@ -1780,15 +1962,29 @@
         <w:jc w:val="both"/>
         <w:rPr>
           <w:szCs w:val="24"/>
+          <w:lang w:val="en-GB"/>
         </w:rPr>
       </w:pPr>
     </w:p>
     <w:p>
       <w:pPr>
         <w:pStyle w:val="Heading2"/>
-      </w:pPr>
-      <w:r>
-        <w:t xml:space="preserve">Ngoại trừ các “Vấn Đề Quan Trọng”,  cả các quyết định của Hội đồng thành viên sẽ được thông qua bằng việc bỏ phiếu, nghị quyết hoặc ưng thuận bởi bên góp vốn sở hữu trên 65% giá trị danh nghĩa của phần vốn góp có mặt và bỏ phiếu trực tiếp hoặc uỷ quyền hoặc cử đại diện công ty tại cuộc họp xem xét vấn đề đó miễn là luôn có một số đại biểu tối thiểu yêu cầu có mặt trong cuộc họp. </w:t>
+        <w:rPr>
+          <w:lang w:val="en-GB"/>
+        </w:rPr>
+      </w:pPr>
+      <w:r>
+        <w:rPr>
+          <w:lang w:val="en-GB"/>
+        </w:rPr>
+        <w:t xml:space="preserve">Từng bên góp vốn xác nhận rằng hợp đồng này được ký kết giữa họ và sẽ được thực hiện theo tinh thần hợp tác lẫn nhau, tín nhiệm, tin cậy và mục tiêu của hợp đồng là kinh doanh, lợi nhuận, uy tín của công ty sẽ được mở rộng và tối đa hoá bằng tất cả </w:t>
+      </w:r>
+      <w:r>
+        <w:rPr>
+          <w:lang w:val="en-GB"/>
+        </w:rPr>
+        <w:lastRenderedPageBreak/>
+        <w:t>các phương thức hợp lý và đúng đắn;</w:t>
       </w:r>
     </w:p>
     <w:p>
@@ -1800,15 +1996,22 @@
         <w:jc w:val="both"/>
         <w:rPr>
           <w:szCs w:val="24"/>
+          <w:lang w:val="en-GB"/>
         </w:rPr>
       </w:pPr>
     </w:p>
     <w:p>
       <w:pPr>
         <w:pStyle w:val="Heading2"/>
-      </w:pPr>
-      <w:r>
-        <w:t xml:space="preserve">Cuộc họp Hội đồng thành viên sẽ thông qua các quyết định trong thẩm quyền bằng biểu quyết bỏ phiếu trong các cuộc họp hoặc lấy ý kiến bằng văn bản, miền là việc bỏ phiếu về bất cứ “Vấn đề quan trọng” nào sẽ chỉ được tiến hành qua tổ chức họp trực tiếp thực tế. </w:t>
+        <w:rPr>
+          <w:lang w:val="en-GB"/>
+        </w:rPr>
+      </w:pPr>
+      <w:r>
+        <w:rPr>
+          <w:lang w:val="en-GB"/>
+        </w:rPr>
+        <w:t>Từng bên góp vốn đồng ý với bên góp vốn kia rằng việc thực hiện các quyền, quyền hạn của mình phải đảm bảo việc kinh doanh của công ty được tiến hành phù hợp với các nguyên tắc kinh doanh quốc tế hợp lý;</w:t>
       </w:r>
     </w:p>
     <w:p>
@@ -1820,85 +2023,7 @@
         <w:jc w:val="both"/>
         <w:rPr>
           <w:szCs w:val="24"/>
-        </w:rPr>
-      </w:pPr>
-    </w:p>
-    <w:p>
-      <w:pPr>
-        <w:pStyle w:val="Heading2"/>
-      </w:pPr>
-      <w:r>
-        <w:t xml:space="preserve">Ngoại trừ các “ Vấn Đề Quan Trọng”, bất cứ quyết định nào của  Hội đồng thành viên sẽ được thông qua không cần tổ chức họp trực tiếp nếu có văn bản đề nghị được thông báo và được duyệt bằng văn bản của  đại diện bên nắm giữ ít nhất </w:t>
-      </w:r>
-      <w:r>
-        <w:rPr>
-          <w:rStyle w:val="normalchar1"/>
-        </w:rPr>
-        <w:t>65</w:t>
-      </w:r>
-      <w:r>
-        <w:t xml:space="preserve">% vốn điều lệ Công ty. </w:t>
-      </w:r>
-    </w:p>
-    <w:p>
-      <w:pPr>
-        <w:tabs>
-          <w:tab w:val="left" w:pos="567"/>
-        </w:tabs>
-        <w:ind w:left="567" w:hanging="567"/>
-        <w:jc w:val="both"/>
-        <w:rPr>
-          <w:szCs w:val="24"/>
-        </w:rPr>
-      </w:pPr>
-    </w:p>
-    <w:p>
-      <w:pPr>
-        <w:pStyle w:val="Heading2"/>
-      </w:pPr>
-      <w:r>
-        <w:t>Ban Giám Đốc</w:t>
-      </w:r>
-    </w:p>
-    <w:p>
-      <w:pPr>
-        <w:tabs>
-          <w:tab w:val="left" w:pos="567"/>
-        </w:tabs>
-        <w:ind w:left="567"/>
-        <w:jc w:val="both"/>
-        <w:rPr>
-          <w:szCs w:val="24"/>
-        </w:rPr>
-      </w:pPr>
-    </w:p>
-    <w:p>
-      <w:pPr>
-        <w:tabs>
-          <w:tab w:val="left" w:pos="567"/>
-        </w:tabs>
-        <w:ind w:left="720"/>
-        <w:jc w:val="both"/>
-        <w:rPr>
-          <w:szCs w:val="24"/>
-        </w:rPr>
-      </w:pPr>
-      <w:r>
-        <w:rPr>
-          <w:szCs w:val="24"/>
-        </w:rPr>
-        <w:t>Tùy thuộc theo thẩm quyền của chung của Hội Đồng Thành Viên Công Ty, Tổng Giám ĐốcCông ty và Ban Giám Đốc hoạt động dưới sự chỉ đạo của Tổng Giám Đốc sẽ có trách nhiệm  điều hành, giám sát, quản lý hoạt động hàng ngày nói chung của Công ty. Các bên đồng ý rằng các công việc hàng ngày của Công ty sẽ được quản lý bởi Tổng Giám Đốc với sự trợ giúp của Ban Giám Đốc do Tổng Giám Đốc thành lập và chỉ đạo. Một cách tổng quát, Hội đồng thành viên, sẽ không quyết định bất cứ vấn đề nào thuộc thẩm quyền điều hành của Tổng Giám Đốc.</w:t>
-      </w:r>
-    </w:p>
-    <w:p>
-      <w:pPr>
-        <w:tabs>
-          <w:tab w:val="left" w:pos="567"/>
-        </w:tabs>
-        <w:ind w:left="567"/>
-        <w:jc w:val="both"/>
-        <w:rPr>
-          <w:szCs w:val="24"/>
+          <w:lang w:val="en-GB"/>
         </w:rPr>
       </w:pPr>
     </w:p>
@@ -1908,7 +2033,152 @@
         <w:spacing w:after="0"/>
       </w:pPr>
       <w:r>
-        <w:t>Hoạt động kinh doanh của Công ty</w:t>
+        <w:t>ĐỊNh đoạt phần vốn góp</w:t>
+      </w:r>
+    </w:p>
+    <w:p>
+      <w:pPr>
+        <w:jc w:val="both"/>
+        <w:rPr>
+          <w:szCs w:val="24"/>
+          <w:lang w:val="en-GB"/>
+        </w:rPr>
+      </w:pPr>
+    </w:p>
+    <w:p>
+      <w:pPr>
+        <w:pStyle w:val="Heading2"/>
+        <w:rPr>
+          <w:lang w:val="en-GB"/>
+        </w:rPr>
+      </w:pPr>
+      <w:r>
+        <w:rPr>
+          <w:lang w:val="en-GB"/>
+        </w:rPr>
+        <w:t>Không bên góp vốn nào được chuyển bất cứ vốn nào cho ai đó khác ngoài bên góp vốn còn lại, ngoại trừ:</w:t>
+      </w:r>
+    </w:p>
+    <w:p>
+      <w:pPr>
+        <w:ind w:left="720" w:hanging="720"/>
+        <w:jc w:val="both"/>
+        <w:rPr>
+          <w:szCs w:val="24"/>
+          <w:lang w:val="en-GB"/>
+        </w:rPr>
+      </w:pPr>
+    </w:p>
+    <w:p>
+      <w:pPr>
+        <w:pStyle w:val="Heading3"/>
+        <w:rPr>
+          <w:lang w:eastAsia="zh-TW"/>
+        </w:rPr>
+      </w:pPr>
+      <w:r>
+        <w:rPr>
+          <w:lang w:eastAsia="zh-TW"/>
+        </w:rPr>
+        <w:t>việc chuyển phần vốn đó xuất phát từ kết quả của việc gửi thông báo chuyển nhượng của một bên góp vốn; hoặc</w:t>
+      </w:r>
+    </w:p>
+    <w:p>
+      <w:pPr>
+        <w:rPr>
+          <w:lang w:eastAsia="zh-TW"/>
+        </w:rPr>
+      </w:pPr>
+    </w:p>
+    <w:p>
+      <w:pPr>
+        <w:pStyle w:val="Heading3"/>
+        <w:rPr>
+          <w:lang w:eastAsia="zh-TW"/>
+        </w:rPr>
+      </w:pPr>
+      <w:r>
+        <w:rPr>
+          <w:lang w:eastAsia="zh-TW"/>
+        </w:rPr>
+        <w:t>Bên góp vốn không chuyển nhượng vốn đồng ý với việc chuyển vốn như vậy.</w:t>
+      </w:r>
+    </w:p>
+    <w:p>
+      <w:pPr>
+        <w:rPr>
+          <w:lang w:eastAsia="zh-TW"/>
+        </w:rPr>
+      </w:pPr>
+    </w:p>
+    <w:p>
+      <w:pPr>
+        <w:pStyle w:val="Heading2"/>
+        <w:rPr>
+          <w:lang w:val="en-GB"/>
+        </w:rPr>
+      </w:pPr>
+      <w:r>
+        <w:rPr>
+          <w:lang w:val="en-GB"/>
+        </w:rPr>
+        <w:t>Các bên góp vốn sẽ đảm bảo rằng các Đại Diện HĐTV sẽ:</w:t>
+      </w:r>
+    </w:p>
+    <w:p>
+      <w:pPr>
+        <w:ind w:left="1437" w:hanging="870"/>
+        <w:rPr>
+          <w:szCs w:val="24"/>
+          <w:lang w:val="en-GB"/>
+        </w:rPr>
+      </w:pPr>
+      <w:r>
+        <w:rPr>
+          <w:szCs w:val="24"/>
+          <w:lang w:val="en-GB"/>
+        </w:rPr>
+        <w:tab/>
+      </w:r>
+    </w:p>
+    <w:p>
+      <w:pPr>
+        <w:pStyle w:val="Heading3"/>
+        <w:rPr>
+          <w:lang w:val="en-GB"/>
+        </w:rPr>
+      </w:pPr>
+      <w:r>
+        <w:rPr>
+          <w:lang w:val="en-GB"/>
+        </w:rPr>
+        <w:t>đăng ký và chuyển nhượng phần vốn góp phù hợp với qui định của hợp đồng này; và</w:t>
+      </w:r>
+    </w:p>
+    <w:p>
+      <w:pPr>
+        <w:tabs>
+          <w:tab w:val="num" w:pos="1350"/>
+        </w:tabs>
+        <w:ind w:left="1350" w:hanging="630"/>
+        <w:rPr>
+          <w:szCs w:val="24"/>
+          <w:lang w:val="en-GB"/>
+        </w:rPr>
+      </w:pPr>
+    </w:p>
+    <w:p>
+      <w:pPr>
+        <w:pStyle w:val="Heading3"/>
+        <w:rPr>
+          <w:lang w:val="en-GB"/>
+        </w:rPr>
+      </w:pPr>
+      <w:r>
+        <w:rPr>
+          <w:lang w:val="en-GB"/>
+        </w:rPr>
+        <w:t>Không đăng ký bất cứ việc chuyển nhượng vốn góp nào có thể dẫn tới việc vi phạm bất cứ qui định nào của Hợp đồng này</w:t>
       </w:r>
     </w:p>
     <w:p>
@@ -1916,433 +2186,55 @@
         <w:tabs>
           <w:tab w:val="left" w:pos="567"/>
         </w:tabs>
-        <w:jc w:val="both"/>
-        <w:rPr>
-          <w:b/>
-          <w:szCs w:val="24"/>
-        </w:rPr>
-      </w:pPr>
-    </w:p>
-    <w:p>
-      <w:pPr>
-        <w:pStyle w:val="Heading2"/>
-      </w:pPr>
-      <w:r>
-        <w:t>Các bên đồng ý rằng hoạt động kinh doanh của Công ty là phát triển và điều hành hoạt động Khu Du Lịch Biển Ngọc Resort Nha Trang (“khu du lịch”) thành một  khu du lịch cao cấp 5 sao đạt tiêu chuẩn quốc tế.</w:t>
-      </w:r>
-    </w:p>
-    <w:p>
-      <w:pPr>
-        <w:ind w:left="720"/>
-        <w:jc w:val="both"/>
-        <w:rPr>
-          <w:szCs w:val="24"/>
-        </w:rPr>
-      </w:pPr>
-    </w:p>
-    <w:p>
-      <w:pPr>
-        <w:pStyle w:val="Heading2"/>
-      </w:pPr>
-      <w:bookmarkStart w:id="10" w:name="_Ref25720722"/>
-      <w:bookmarkEnd w:id="7"/>
-      <w:bookmarkEnd w:id="8"/>
-      <w:bookmarkEnd w:id="9"/>
-      <w:r>
-        <w:t xml:space="preserve">Thông qua Hội Đồng Thành Viên, và Đại Diện Của Bên B như nói tại đây hai bên đồng ý thực hiện theo chuẩn mực quốc tế việc lập quy hoạch, thiết kế thực hiện xây dựng và phát triển dự án. </w:t>
-      </w:r>
-    </w:p>
-    <w:p/>
-    <w:p>
-      <w:pPr>
-        <w:pStyle w:val="Heading2"/>
-      </w:pPr>
-      <w:r>
-        <w:t>Các bên sẽ đảm bảo, thông qua Tổng Giám Đốc và công ty quản lý khách sạn đã chỉ định, khu du lịch sẽ mở cửa tại thời điểm sớm nhất một cách hợp lý; và khu du lịch sẽ hoạt động theo tiêu chuẩn quốc tế;</w:t>
-      </w:r>
-    </w:p>
-    <w:p>
-      <w:pPr>
-        <w:widowControl/>
-        <w:ind w:left="1080"/>
-        <w:jc w:val="both"/>
-        <w:rPr>
-          <w:szCs w:val="24"/>
-        </w:rPr>
-      </w:pPr>
-    </w:p>
-    <w:bookmarkEnd w:id="10"/>
-    <w:p>
-      <w:pPr>
-        <w:pStyle w:val="Heading2"/>
-      </w:pPr>
-      <w:r>
-        <w:t>Mỗi bên (nếu có thể làm một cách hợp pháp) đảm bảo rằng Công ty sẽ thực hiện việc kinh doanh một cách đặc biệt hơn mô tả trên, phù hợp với hợp đồng này</w:t>
-      </w:r>
-    </w:p>
-    <w:p>
-      <w:pPr>
-        <w:tabs>
-          <w:tab w:val="left" w:pos="720"/>
-        </w:tabs>
-        <w:ind w:left="720"/>
-        <w:jc w:val="both"/>
-        <w:rPr>
-          <w:szCs w:val="24"/>
-          <w:lang w:eastAsia="zh-TW"/>
-        </w:rPr>
-      </w:pPr>
-    </w:p>
-    <w:p>
-      <w:pPr>
-        <w:jc w:val="both"/>
-        <w:rPr>
-          <w:b/>
-        </w:rPr>
-      </w:pPr>
-      <w:r>
-        <w:rPr>
-          <w:b/>
-        </w:rPr>
-        <w:t xml:space="preserve">ĐIỀU 7BIS. </w:t>
-        <w:tab/>
-        <w:t>BẾ TẮC TRONG HOẠT ĐỘNG VÀ THỦ TỤC CHẤM DỨT ĐẦU TƯ</w:t>
-      </w:r>
-    </w:p>
-    <w:p>
-      <w:pPr>
-        <w:jc w:val="both"/>
-        <w:rPr>
-          <w:b/>
-        </w:rPr>
-      </w:pPr>
-    </w:p>
-    <w:p>
-      <w:pPr>
-        <w:ind w:left="720" w:hanging="720"/>
-        <w:jc w:val="both"/>
-        <w:rPr>
-          <w:szCs w:val="24"/>
-          <w:lang w:val="en-GB"/>
-        </w:rPr>
-      </w:pPr>
-      <w:r>
-        <w:rPr>
-          <w:szCs w:val="24"/>
-          <w:lang w:val="en-GB"/>
-        </w:rPr>
-        <w:t>7bis.1.</w:t>
-        <w:tab/>
-        <w:t xml:space="preserve">Nếu một đề nghị trình cho Hội Đồng Thành Viên hoặc cho các bên góp vốn và không được thông qua sau hai lần họp thì </w:t>
-      </w:r>
-      <w:r>
-        <w:rPr>
-          <w:szCs w:val="24"/>
-        </w:rPr>
-        <w:t xml:space="preserve">Sự Kiện Bế Tắc được coi là </w:t>
-      </w:r>
-      <w:r>
-        <w:rPr>
-          <w:szCs w:val="24"/>
-          <w:lang w:val="en-GB"/>
-        </w:rPr>
-        <w:t>đã xảy ra vào ngày của cuộc họp lần thứ hai của Hội đồng thành viên  hoặc của Ban Giám Đốc tuỳ theo tình hình.</w:t>
-      </w:r>
-    </w:p>
-    <w:p>
-      <w:pPr>
-        <w:ind w:left="1080"/>
-        <w:rPr>
-          <w:szCs w:val="24"/>
-        </w:rPr>
-      </w:pPr>
-    </w:p>
-    <w:p>
-      <w:pPr>
-        <w:tabs>
-          <w:tab w:val="left" w:pos="720"/>
-        </w:tabs>
-        <w:ind w:left="720" w:hanging="720"/>
-        <w:jc w:val="both"/>
-        <w:rPr>
-          <w:szCs w:val="24"/>
-          <w:lang w:val="en-GB"/>
-        </w:rPr>
-      </w:pPr>
-      <w:r>
-        <w:rPr>
-          <w:szCs w:val="24"/>
-        </w:rPr>
-        <w:t>7bis.2.</w:t>
-        <w:tab/>
-      </w:r>
-      <w:r>
-        <w:rPr>
-          <w:szCs w:val="24"/>
-          <w:lang w:val="en-GB"/>
-        </w:rPr>
-        <w:t xml:space="preserve">Mỗi bên xác đinh quyền lợi chung của các bên trong việc giải quyết Bế Tắc và sẽ nỗ lực giải quyết Bế Tắc như vậy một cách thiện chí và vì quyền lợi của Công Ty để duy trì hoạt động kinh doanh đang sinh lãi; </w:t>
-      </w:r>
-    </w:p>
-    <w:p>
-      <w:pPr>
-        <w:tabs>
-          <w:tab w:val="left" w:pos="720"/>
-        </w:tabs>
-        <w:ind w:left="720" w:hanging="720"/>
-        <w:jc w:val="both"/>
-        <w:rPr>
-          <w:szCs w:val="24"/>
-          <w:lang w:eastAsia="zh-TW"/>
-        </w:rPr>
-      </w:pPr>
-      <w:bookmarkStart w:id="11" w:name="_Ref31129339"/>
-      <w:bookmarkStart w:id="12" w:name="_Ref31119044"/>
-    </w:p>
-    <w:p>
-      <w:pPr>
-        <w:tabs>
-          <w:tab w:val="left" w:pos="720"/>
-        </w:tabs>
-        <w:ind w:left="720" w:hanging="720"/>
-        <w:jc w:val="both"/>
-        <w:rPr>
-          <w:szCs w:val="24"/>
-          <w:lang w:eastAsia="zh-TW"/>
-        </w:rPr>
-      </w:pPr>
-      <w:r>
-        <w:rPr>
-          <w:szCs w:val="24"/>
-          <w:lang w:eastAsia="zh-TW"/>
-        </w:rPr>
-        <w:t>7bis.3.</w:t>
-        <w:tab/>
-        <w:t xml:space="preserve">Nếu có môt Bế Tắc xảy ra hoặc được coi như đã xảy ra và các bên góp vốn không thể giải quyết trong vòng </w:t>
-      </w:r>
-      <w:r>
-        <w:rPr>
-          <w:rStyle w:val="normalchar1"/>
-        </w:rPr>
-        <w:t>30</w:t>
-      </w:r>
-      <w:r>
-        <w:rPr>
-          <w:szCs w:val="24"/>
-          <w:lang w:eastAsia="zh-TW"/>
-        </w:rPr>
-        <w:t xml:space="preserve"> ngày, mỗi bên góp vốn sẽ có thể yêu cầu áp dụng một trong các cơ chế giải quyết bế tắc theo quy định tại Hợp đồng này, bao gồm nhưng không giới hạn việc chào mua phần vốn góp của bên kia hoặc yêu cầu bên kia mua lại phần vốn góp của mình theo giá thị trường hợp lý tại thời điểm đó.</w:t>
-      </w:r>
-    </w:p>
-    <w:p>
-      <w:pPr>
-        <w:tabs>
-          <w:tab w:val="left" w:pos="720"/>
-        </w:tabs>
-        <w:ind w:left="720" w:hanging="720"/>
-        <w:jc w:val="both"/>
-        <w:rPr>
-          <w:szCs w:val="24"/>
-          <w:lang w:eastAsia="zh-TW"/>
-        </w:rPr>
-      </w:pPr>
-    </w:p>
-    <w:p>
-      <w:pPr>
-        <w:tabs>
-          <w:tab w:val="left" w:pos="900"/>
-        </w:tabs>
-        <w:ind w:left="900" w:hanging="900"/>
-        <w:jc w:val="both"/>
-        <w:rPr>
-          <w:szCs w:val="24"/>
-          <w:lang w:eastAsia="zh-TW"/>
-        </w:rPr>
-      </w:pPr>
-      <w:r>
-        <w:rPr>
-          <w:szCs w:val="24"/>
-          <w:lang w:eastAsia="zh-TW"/>
-        </w:rPr>
-        <w:t xml:space="preserve">7bis.3.1. chỉ định một nhà tư vấn không thuộc bên nào tham gia như một Thành Viên HĐTV Độc Lập và tham gia thảo luận và biểu quyết để đảm bảo một trong hai bên trong HĐTV có đủ số phiếu biểu quyết đa số để ra quyết đính và chấm dứt tình trạng bế tắc của Công Ty. Thành Viên HĐTV độc lập này không có trách nhiệm báo cáo hay nhận sự chỉ đạo của bất cứ bên nào, mà sẽ chi biểu quyết vi quyền lợi của và được thanh toán bởi Công Ty; </w:t>
-      </w:r>
-    </w:p>
-    <w:p>
-      <w:pPr>
-        <w:tabs>
-          <w:tab w:val="left" w:pos="720"/>
-        </w:tabs>
-        <w:ind w:left="720"/>
-        <w:jc w:val="both"/>
-        <w:rPr>
-          <w:szCs w:val="24"/>
-          <w:lang w:eastAsia="zh-TW"/>
-        </w:rPr>
-      </w:pPr>
-      <w:r>
-        <w:rPr>
-          <w:szCs w:val="24"/>
-          <w:lang w:eastAsia="zh-TW"/>
-        </w:rPr>
-        <w:t xml:space="preserve"> </w:t>
-      </w:r>
-    </w:p>
-    <w:p>
-      <w:pPr>
-        <w:tabs>
-          <w:tab w:val="left" w:pos="900"/>
-        </w:tabs>
-        <w:ind w:left="900" w:hanging="900"/>
-        <w:jc w:val="both"/>
-        <w:rPr>
-          <w:szCs w:val="24"/>
-          <w:lang w:eastAsia="zh-TW"/>
-        </w:rPr>
-      </w:pPr>
-      <w:r>
-        <w:rPr>
-          <w:szCs w:val="24"/>
-          <w:lang w:eastAsia="zh-TW"/>
-        </w:rPr>
-        <w:t>7bis.3.2. ra thông báo (“thông báo chuyển nhượng”) để chuyển nhượng phần vốn của mình trong Công ty</w:t>
-      </w:r>
-    </w:p>
-    <w:p>
-      <w:pPr>
-        <w:tabs>
-          <w:tab w:val="left" w:pos="720"/>
-        </w:tabs>
-        <w:ind w:left="720" w:hanging="720"/>
-        <w:jc w:val="both"/>
-        <w:rPr>
-          <w:szCs w:val="24"/>
-          <w:lang w:eastAsia="zh-TW"/>
-        </w:rPr>
-      </w:pPr>
-    </w:p>
-    <w:bookmarkEnd w:id="11"/>
-    <w:bookmarkEnd w:id="12"/>
+        <w:ind w:left="567" w:hanging="567"/>
+        <w:rPr>
+          <w:szCs w:val="24"/>
+          <w:lang w:val="en-GB"/>
+        </w:rPr>
+      </w:pPr>
+    </w:p>
     <w:p>
       <w:pPr>
         <w:pStyle w:val="Heading1"/>
         <w:spacing w:after="0"/>
       </w:pPr>
       <w:r>
-        <w:t>Các nghĩa vụ khác của các bên góp vốn</w:t>
-      </w:r>
-    </w:p>
-    <w:p>
-      <w:pPr>
-        <w:rPr>
+        <w:t>Các đảm bảo khác:</w:t>
+      </w:r>
+    </w:p>
+    <w:p>
+      <w:pPr>
+        <w:ind w:left="720"/>
+        <w:jc w:val="both"/>
+        <w:rPr>
+          <w:szCs w:val="24"/>
+          <w:lang w:val="en-GB"/>
+        </w:rPr>
+      </w:pPr>
+    </w:p>
+    <w:p>
+      <w:pPr>
+        <w:ind w:left="720"/>
+        <w:jc w:val="both"/>
+        <w:rPr>
+          <w:szCs w:val="24"/>
+          <w:lang w:val="en-GB"/>
+        </w:rPr>
+      </w:pPr>
+      <w:r>
+        <w:rPr>
+          <w:szCs w:val="24"/>
+          <w:lang w:val="en-GB"/>
+        </w:rPr>
+        <w:t>Các bên sẽ thực hiện và đảm bảo thực hiện tất cả các luật, hợp đồng, văn bản, công việc khác như có thể cần thiết để đảm bảo hiệu lực hoàn toàn cho các điều khoản của hợp đồng này.</w:t>
+      </w:r>
+    </w:p>
+    <w:p>
+      <w:pPr>
+        <w:jc w:val="both"/>
+        <w:rPr>
+          <w:szCs w:val="24"/>
           <w:lang w:val="en-GB" w:eastAsia="zh-TW"/>
-        </w:rPr>
-      </w:pPr>
-    </w:p>
-    <w:p>
-      <w:pPr>
-        <w:pStyle w:val="Heading2"/>
-        <w:rPr>
-          <w:lang w:val="en-GB"/>
-        </w:rPr>
-      </w:pPr>
-      <w:r>
-        <w:rPr>
-          <w:lang w:val="en-GB"/>
-        </w:rPr>
-        <w:t xml:space="preserve">Từng bên góp vốn sẽ hỗ trợ theo khả năng của mình để Công Ty đạt được tất cả các giấy phép, phê duyệt, cho phép theo yêu cầu của luật pháp và các qui định của Việt nam được áp dụng cho hoạt động kinh doanh. </w:t>
-      </w:r>
-    </w:p>
-    <w:p>
-      <w:pPr>
-        <w:tabs>
-          <w:tab w:val="left" w:pos="567"/>
-        </w:tabs>
-        <w:ind w:left="567" w:hanging="567"/>
-        <w:jc w:val="both"/>
-        <w:rPr>
-          <w:szCs w:val="24"/>
-          <w:lang w:val="en-GB"/>
-        </w:rPr>
-      </w:pPr>
-    </w:p>
-    <w:p>
-      <w:pPr>
-        <w:pStyle w:val="Heading2"/>
-        <w:rPr>
-          <w:lang w:val="en-GB"/>
-        </w:rPr>
-      </w:pPr>
-      <w:r>
-        <w:rPr>
-          <w:lang w:val="en-GB"/>
-        </w:rPr>
-        <w:t>Các Bên sẽ đảm bảo rằng không muộn hơn hai tháng trước khi bắt đầu năm tài chính, Tổng Giám Đốc của Công Ty sẽ chuẩn bị và gửi cho các Đại Diện HĐTV bản đề nghị kế hoạch kinh doanh và bản đề nghị ngân sách  hàng năm cho năm tài chính tiếp theo.</w:t>
-      </w:r>
-    </w:p>
-    <w:p>
-      <w:pPr>
-        <w:tabs>
-          <w:tab w:val="left" w:pos="567"/>
-        </w:tabs>
-        <w:ind w:left="567" w:hanging="567"/>
-        <w:jc w:val="both"/>
-        <w:rPr>
-          <w:szCs w:val="24"/>
-          <w:lang w:val="en-GB"/>
-        </w:rPr>
-      </w:pPr>
-    </w:p>
-    <w:p>
-      <w:pPr>
-        <w:pStyle w:val="Heading2"/>
-        <w:rPr>
-          <w:lang w:val="en-GB"/>
-        </w:rPr>
-      </w:pPr>
-      <w:r>
-        <w:rPr>
-          <w:lang w:val="en-GB"/>
-        </w:rPr>
-        <w:t>Từng bên góp vốn xác nhận rằng hợp đồng này được ký kết giữa họ và sẽ được thực hiện theo tinh thần hợp tác lẫn nhau, tín nhiệm, tin cậy và mục tiêu của hợp đồng là kinh doanh, lợi nhuận, uy tín của công ty sẽ được mở rộng và tối đa hoá bằng tất cả các phương thức hợp lý và đúng đắn;</w:t>
-      </w:r>
-    </w:p>
-    <w:p>
-      <w:pPr>
-        <w:tabs>
-          <w:tab w:val="left" w:pos="567"/>
-        </w:tabs>
-        <w:ind w:left="567" w:hanging="567"/>
-        <w:jc w:val="both"/>
-        <w:rPr>
-          <w:szCs w:val="24"/>
-          <w:lang w:val="en-GB"/>
-        </w:rPr>
-      </w:pPr>
-    </w:p>
-    <w:p>
-      <w:pPr>
-        <w:pStyle w:val="Heading2"/>
-        <w:rPr>
-          <w:lang w:val="en-GB"/>
-        </w:rPr>
-      </w:pPr>
-      <w:r>
-        <w:rPr>
-          <w:lang w:val="en-GB"/>
-        </w:rPr>
-        <w:t>Từng bên góp vốn đồng ý với bên góp vốn kia rằng việc thực hiện các quyền, quyền hạn của mình phải đảm bảo việc kinh doanh của công ty được tiến hành phù hợp với các nguyên tắc kinh doanh quốc tế hợp lý;</w:t>
-      </w:r>
-    </w:p>
-    <w:p>
-      <w:pPr>
-        <w:tabs>
-          <w:tab w:val="left" w:pos="567"/>
-        </w:tabs>
-        <w:ind w:left="567" w:hanging="567"/>
-        <w:jc w:val="both"/>
-        <w:rPr>
-          <w:szCs w:val="24"/>
-          <w:lang w:val="en-GB"/>
         </w:rPr>
       </w:pPr>
     </w:p>
@@ -2352,30 +2244,22 @@
         <w:spacing w:after="0"/>
       </w:pPr>
       <w:r>
-        <w:t>ĐỊNh đoạt phần vốn góp</w:t>
-      </w:r>
-    </w:p>
-    <w:p>
-      <w:pPr>
-        <w:jc w:val="both"/>
-        <w:rPr>
-          <w:szCs w:val="24"/>
-          <w:lang w:val="en-GB"/>
+        <w:t>Bảo mật</w:t>
+      </w:r>
+    </w:p>
+    <w:p>
+      <w:pPr>
+        <w:rPr>
+          <w:lang w:val="en-GB" w:eastAsia="zh-TW"/>
         </w:rPr>
       </w:pPr>
     </w:p>
     <w:p>
       <w:pPr>
         <w:pStyle w:val="Heading2"/>
-        <w:rPr>
-          <w:lang w:val="en-GB"/>
-        </w:rPr>
-      </w:pPr>
-      <w:r>
-        <w:rPr>
-          <w:lang w:val="en-GB"/>
-        </w:rPr>
-        <w:t>Không bên góp vốn nào được chuyển bất cứ vốn nào cho ai đó khác ngoài bên góp vốn còn lại, ngoại trừ:</w:t>
+      </w:pPr>
+      <w:r>
+        <w:t>Từng bên cam kết với bên kia rằng mình sẽ không và đảm bảo các viên chức, nhân viên, người đại diện, cấp dưới và những người khác dưới sự kiểm soát của mình và viên chức, nhân viên, người đại diện của những người này trong suốt thời hạn của hợp đồng này và trong vòng 05 (năm) năm sau khi chấm dứt hợp đồng này (vì bất cứ lý do gì): bảo lưu một cách đúng đắn các qui định về làm việc cho công ty, dùng hoặc để lộ cho bất cứ ai, thông báo hoặc tiết lộ hoặc cho phép thông báo hoặc tiết lộ bất cứ bí mật hay thông tin bảo mật nào liên quan tới công ty hoặc các bên khác mà họ nhận được, đạt được hay có thể nhận được, đạt được (cho dù có hay không trường hợp các tài liệu được ghi chú là tài liệu mật) miễn là các nghĩa vụ của điều khoản này không áp dụng cho:</w:t>
       </w:r>
     </w:p>
     <w:p>
@@ -2384,142 +2268,42 @@
         <w:jc w:val="both"/>
         <w:rPr>
           <w:szCs w:val="24"/>
-          <w:lang w:val="en-GB"/>
         </w:rPr>
       </w:pPr>
     </w:p>
     <w:p>
       <w:pPr>
         <w:pStyle w:val="Heading3"/>
-        <w:rPr>
-          <w:lang w:eastAsia="zh-TW"/>
-        </w:rPr>
-      </w:pPr>
-      <w:r>
-        <w:rPr>
-          <w:lang w:eastAsia="zh-TW"/>
-        </w:rPr>
-        <w:t>việc chuyển phần vốn đó xuất phát từ kết quả của việc gửi thông báo chuyển nhượng của một bên góp vốn; hoặc</w:t>
-      </w:r>
-    </w:p>
-    <w:p>
-      <w:pPr>
-        <w:rPr>
-          <w:lang w:eastAsia="zh-TW"/>
-        </w:rPr>
-      </w:pPr>
-    </w:p>
+      </w:pPr>
+      <w:r>
+        <w:t>việc tiết lộ thông tin mà người nhận có thể chứng minh một cách có lý là nó thuộc về công cộng và họ không có lỗi; hoặc</w:t>
+      </w:r>
+    </w:p>
+    <w:p/>
     <w:p>
       <w:pPr>
         <w:pStyle w:val="Heading3"/>
-        <w:rPr>
-          <w:lang w:eastAsia="zh-TW"/>
-        </w:rPr>
-      </w:pPr>
-      <w:r>
-        <w:rPr>
-          <w:lang w:eastAsia="zh-TW"/>
-        </w:rPr>
-        <w:t>Bên góp vốn không chuyển nhượng vốn đồng ý với việc chuyển vốn như vậy.</w:t>
-      </w:r>
-    </w:p>
-    <w:p>
-      <w:pPr>
-        <w:rPr>
-          <w:lang w:eastAsia="zh-TW"/>
-        </w:rPr>
-      </w:pPr>
-    </w:p>
-    <w:p>
-      <w:pPr>
-        <w:pStyle w:val="Heading2"/>
-        <w:rPr>
-          <w:lang w:val="en-GB"/>
-        </w:rPr>
-      </w:pPr>
-      <w:r>
-        <w:rPr>
-          <w:lang w:val="en-GB"/>
-        </w:rPr>
-        <w:t>Các bên góp vốn sẽ đảm bảo rằng các Đại Diện HĐTV sẽ:</w:t>
-      </w:r>
-    </w:p>
-    <w:p>
-      <w:pPr>
-        <w:ind w:left="1437" w:hanging="870"/>
-        <w:rPr>
-          <w:szCs w:val="24"/>
-          <w:lang w:val="en-GB"/>
-        </w:rPr>
-      </w:pPr>
-      <w:r>
-        <w:rPr>
-          <w:szCs w:val="24"/>
-          <w:lang w:val="en-GB"/>
-        </w:rPr>
-        <w:tab/>
-      </w:r>
-    </w:p>
-    <w:p>
-      <w:pPr>
-        <w:pStyle w:val="Heading3"/>
-        <w:rPr>
-          <w:lang w:val="en-GB"/>
-        </w:rPr>
-      </w:pPr>
-      <w:r>
-        <w:rPr>
-          <w:lang w:val="en-GB"/>
-        </w:rPr>
-        <w:t>đăng ký và chuyển nhượng phần vốn góp phù hợp với qui định của hợp đồng này; và</w:t>
-      </w:r>
-    </w:p>
-    <w:p>
-      <w:pPr>
-        <w:tabs>
-          <w:tab w:val="num" w:pos="1350"/>
-        </w:tabs>
-        <w:ind w:left="1350" w:hanging="630"/>
-        <w:rPr>
-          <w:szCs w:val="24"/>
-          <w:lang w:val="en-GB"/>
-        </w:rPr>
-      </w:pPr>
-    </w:p>
-    <w:p>
-      <w:pPr>
-        <w:pStyle w:val="Heading3"/>
-        <w:rPr>
-          <w:lang w:val="en-GB"/>
-        </w:rPr>
-      </w:pPr>
-      <w:r>
-        <w:rPr>
-          <w:lang w:val="en-GB"/>
-        </w:rPr>
-        <w:t>Không đăng ký bất cứ việc chuyển nhượng vốn góp nào có thể dẫn tới việc vi phạm bất cứ qui định nào của Hợp đồng này</w:t>
-      </w:r>
-    </w:p>
-    <w:p>
-      <w:pPr>
-        <w:tabs>
-          <w:tab w:val="left" w:pos="567"/>
-        </w:tabs>
-        <w:ind w:left="567" w:hanging="567"/>
-        <w:rPr>
-          <w:szCs w:val="24"/>
-          <w:lang w:val="en-GB"/>
-        </w:rPr>
-      </w:pPr>
-    </w:p>
+      </w:pPr>
+      <w:r>
+        <w:t>việc tiết lộ thông tin một cách bảo mật cho bất cứ nhà tư vấn chuyên môn nào hay cho bất cứ bên nào nhằm mục đích đạt được các tư vấn, trợ giúp liên quan tới nghĩa vụ hoặc quyền của bên đó hoặc nghĩa vụ hoặc quyền của các bên trong hợp đồng này.</w:t>
+      </w:r>
+    </w:p>
+    <w:p/>
     <w:p>
       <w:pPr>
         <w:pStyle w:val="Heading1"/>
         <w:spacing w:after="0"/>
       </w:pPr>
       <w:r>
-        <w:t>Các đảm bảo khác:</w:t>
-      </w:r>
+        <w:t>Khắc phục</w:t>
+      </w:r>
+    </w:p>
+    <w:p>
+      <w:pPr>
+        <w:rPr>
+          <w:lang w:val="en-GB" w:eastAsia="zh-TW"/>
+        </w:rPr>
+      </w:pPr>
     </w:p>
     <w:p>
       <w:pPr>
@@ -2530,30 +2314,20 @@
           <w:lang w:val="en-GB"/>
         </w:rPr>
       </w:pPr>
-    </w:p>
-    <w:p>
-      <w:pPr>
-        <w:ind w:left="720"/>
-        <w:jc w:val="both"/>
-        <w:rPr>
-          <w:szCs w:val="24"/>
-          <w:lang w:val="en-GB"/>
-        </w:rPr>
-      </w:pPr>
-      <w:r>
-        <w:rPr>
-          <w:szCs w:val="24"/>
-          <w:lang w:val="en-GB"/>
-        </w:rPr>
-        <w:t>Các bên sẽ thực hiện và đảm bảo thực hiện tất cả các luật, hợp đồng, văn bản, công việc khác như có thể cần thiết để đảm bảo hiệu lực hoàn toàn cho các điều khoản của hợp đồng này.</w:t>
-      </w:r>
-    </w:p>
-    <w:p>
-      <w:pPr>
-        <w:jc w:val="both"/>
-        <w:rPr>
-          <w:szCs w:val="24"/>
-          <w:lang w:val="en-GB" w:eastAsia="zh-TW"/>
+      <w:r>
+        <w:rPr>
+          <w:szCs w:val="24"/>
+          <w:lang w:val="en-GB"/>
+        </w:rPr>
+        <w:t>Mỗi bên xác nhận và đồng ý rằng nếu bên nào vi phạm các cam kết, đảm bảo, thoả thuận, nghĩa vụ (gọi là “các điều khoản đã đồng ý”) của mình trong hợp đồng này hoặc bất cứ hợp đồng, thoả thuận nào đã ký tuân theo hợp đồng này, theo đó các thiệt hại nếu không được khắc phục đầy đủ khi đó các điều khoản đã đồng ý sẽ được thực thi để thực hiện các nghĩa vụ cụ thể đó hoặc giảm nhẹ thiệt hại một cách công bằng mà một phiên toà của cơ quan tư pháp thẩm quyền thấy là thích hợp để quyết định</w:t>
+      </w:r>
+    </w:p>
+    <w:p>
+      <w:pPr>
+        <w:jc w:val="both"/>
+        <w:rPr>
+          <w:szCs w:val="24"/>
+          <w:lang w:val="en-GB"/>
         </w:rPr>
       </w:pPr>
     </w:p>
@@ -2563,7 +2337,7 @@
         <w:spacing w:after="0"/>
       </w:pPr>
       <w:r>
-        <w:t>Bảo mật</w:t>
+        <w:t>Chi phí</w:t>
       </w:r>
     </w:p>
     <w:p>
@@ -2575,46 +2349,38 @@
     </w:p>
     <w:p>
       <w:pPr>
-        <w:pStyle w:val="Heading2"/>
-      </w:pPr>
-      <w:r>
-        <w:t>Từng bên cam kết với bên kia rằng mình sẽ không và đảm bảo các viên chức, nhân viên, người đại diện, cấp dưới và những người khác dưới sự kiểm soát của mình và viên chức, nhân viên, người đại diện của những người này trong suốt thời hạn của hợp đồng này và trong vòng 05 (năm) năm sau khi chấm dứt hợp đồng này (vì bất cứ lý do gì): bảo lưu một cách đúng đắn các qui định về làm việc cho công ty, dùng hoặc để lộ cho bất cứ ai, thông báo hoặc tiết lộ hoặc cho phép thông báo hoặc tiết lộ bất cứ bí mật hay thông tin bảo mật nào liên quan tới công ty hoặc các bên khác mà họ nhận được, đạt được hay có thể nhận được, đạt được (cho dù có hay không trường hợp các tài liệu được ghi chú là tài liệu mật) miễn là các nghĩa vụ của điều khoản này không áp dụng cho:</w:t>
-      </w:r>
-    </w:p>
-    <w:p>
-      <w:pPr>
-        <w:ind w:left="720" w:hanging="720"/>
-        <w:jc w:val="both"/>
-        <w:rPr>
-          <w:szCs w:val="24"/>
-        </w:rPr>
-      </w:pPr>
-    </w:p>
-    <w:p>
-      <w:pPr>
-        <w:pStyle w:val="Heading3"/>
-      </w:pPr>
-      <w:r>
-        <w:t>việc tiết lộ thông tin mà người nhận có thể chứng minh một cách có lý là nó thuộc về công cộng và họ không có lỗi; hoặc</w:t>
-      </w:r>
-    </w:p>
-    <w:p/>
-    <w:p>
-      <w:pPr>
-        <w:pStyle w:val="Heading3"/>
-      </w:pPr>
-      <w:r>
-        <w:t>việc tiết lộ thông tin một cách bảo mật cho bất cứ nhà tư vấn chuyên môn nào hay cho bất cứ bên nào nhằm mục đích đạt được các tư vấn, trợ giúp liên quan tới nghĩa vụ hoặc quyền của bên đó hoặc nghĩa vụ hoặc quyền của các bên trong hợp đồng này.</w:t>
-      </w:r>
-    </w:p>
-    <w:p/>
+        <w:ind w:left="720"/>
+        <w:jc w:val="both"/>
+        <w:rPr>
+          <w:szCs w:val="24"/>
+          <w:lang w:val="en-GB"/>
+        </w:rPr>
+      </w:pPr>
+      <w:r>
+        <w:rPr>
+          <w:szCs w:val="24"/>
+          <w:lang w:val="en-GB"/>
+        </w:rPr>
+        <w:t>Từng bên sẽ chịu các chi phí, chi tiêu của mình của hoặc có liên quan tới sự chuẩn bị, đàm phán, ký kết và thực hiện hợp đồng này và các tài liệu liên quan.</w:t>
+      </w:r>
+    </w:p>
+    <w:p>
+      <w:pPr>
+        <w:ind w:left="426" w:hanging="66"/>
+        <w:jc w:val="both"/>
+        <w:rPr>
+          <w:szCs w:val="24"/>
+          <w:lang w:val="en-GB"/>
+        </w:rPr>
+      </w:pPr>
+    </w:p>
     <w:p>
       <w:pPr>
         <w:pStyle w:val="Heading1"/>
         <w:spacing w:after="0"/>
       </w:pPr>
       <w:r>
-        <w:t>Khắc phục</w:t>
+        <w:t>Chuyển nhượng</w:t>
       </w:r>
     </w:p>
     <w:p>
@@ -2626,29 +2392,132 @@
     </w:p>
     <w:p>
       <w:pPr>
-        <w:ind w:left="720"/>
-        <w:jc w:val="both"/>
-        <w:rPr>
-          <w:szCs w:val="24"/>
-          <w:lang w:val="en-GB"/>
-        </w:rPr>
-      </w:pPr>
-      <w:r>
-        <w:rPr>
-          <w:szCs w:val="24"/>
-          <w:lang w:val="en-GB"/>
-        </w:rPr>
-        <w:t>Mỗi bên xác nhận và đồng ý rằng nếu bên nào vi phạm các cam kết, đảm bảo, thoả thuận, nghĩa vụ (gọi là “các điều khoản đã đồng ý”) của mình trong hợp đồng này hoặc bất cứ hợp đồng, thoả thuận nào đã ký tuân theo hợp đồng này, theo đó các thiệt hại nếu không được khắc phục đầy đủ khi đó các điều khoản đã đồng ý sẽ được thực thi để thực hiện các nghĩa vụ cụ thể đó hoặc giảm nhẹ thiệt hại một cách công bằng mà một phiên toà của cơ quan tư pháp thẩm quyền thấy là thích hợp để quyết định</w:t>
-      </w:r>
-    </w:p>
-    <w:p>
-      <w:pPr>
-        <w:jc w:val="both"/>
-        <w:rPr>
-          <w:szCs w:val="24"/>
-          <w:lang w:val="en-GB"/>
-        </w:rPr>
-      </w:pPr>
+        <w:pStyle w:val="Heading2"/>
+      </w:pPr>
+      <w:r>
+        <w:t xml:space="preserve">Ngoại trừ qui định khác đi, quyền lợi và nghĩa vụ theo hợp đồng này đối với từng bên trong hợp đồng là cho chính bản thân bên đó và sẽ không được chuyển nhượng, chuyển giao hoặc xử lý khác đi trừ khi có sự đồng ý bằng văn bản của bên kia; </w:t>
+      </w:r>
+    </w:p>
+    <w:p/>
+    <w:p>
+      <w:pPr>
+        <w:pStyle w:val="Heading2"/>
+        <w:rPr>
+          <w:lang w:val="en-GB"/>
+        </w:rPr>
+      </w:pPr>
+      <w:r>
+        <w:rPr>
+          <w:lang w:val="en-GB"/>
+        </w:rPr>
+        <w:t xml:space="preserve">Các Bên thống nhất, khi một trong hai bên muốn chuyển nhượng phần vốn góp của mình trong Công Ty (“Bên Chuyển Nhượng”), Bên này trước tiên cần thông báo cho bên (hoặc các bên) Bên Không Chuyển Nhượng ý định của mình cùng giá cả và các điều kiện chuyển nhượng khác và cho phép bên không chuyển nhượng quyền ưu tiên được nhận chuyển nhượng phần vốn góp của mình so với bất kỳ một bên thứ ba nào khác. </w:t>
+      </w:r>
+    </w:p>
+    <w:p>
+      <w:pPr>
+        <w:ind w:left="720" w:hanging="720"/>
+        <w:rPr>
+          <w:lang w:val="en-GB"/>
+        </w:rPr>
+      </w:pPr>
+    </w:p>
+    <w:p>
+      <w:pPr>
+        <w:pStyle w:val="Heading1"/>
+        <w:rPr>
+          <w:rFonts w:eastAsia="Times New Roman"/>
+        </w:rPr>
+      </w:pPr>
+      <w:r>
+        <w:rPr>
+          <w:rFonts w:eastAsia="Times New Roman"/>
+        </w:rPr>
+        <w:t>Giải Quyết Tranh Chấp Nội Bộ</w:t>
+      </w:r>
+    </w:p>
+    <w:p>
+      <w:pPr>
+        <w:pStyle w:val="Heading2"/>
+        <w:rPr>
+          <w:rFonts w:eastAsia="Times New Roman"/>
+        </w:rPr>
+      </w:pPr>
+      <w:r>
+        <w:rPr>
+          <w:rFonts w:eastAsia="Times New Roman"/>
+        </w:rPr>
+        <w:t>Trước khi đưa bất kỳ tranh chấp nào ra trọng tài hoặc tòa án, các Bên có nghĩa vụ thương lượng thiện chí trong vòng 30 (ba mươi) ngày kể từ ngày một Bên gửi thông báo tranh chấp bằng văn bản cho Bên kia.</w:t>
+      </w:r>
+    </w:p>
+    <w:p>
+      <w:pPr>
+        <w:pStyle w:val="Heading2"/>
+        <w:rPr>
+          <w:rFonts w:eastAsia="Times New Roman"/>
+        </w:rPr>
+      </w:pPr>
+      <w:r>
+        <w:rPr>
+          <w:rFonts w:eastAsia="Times New Roman"/>
+        </w:rPr>
+        <w:t>Nếu không đạt được thỏa thuận sau 30 ngày thương lượng, các Bên có thể yêu cầu chỉ định một chuyên gia hòa giải độc lập được cả hai Bên chấp thuận. Chi phí hòa giải được chia đều giữa các Bên. Kết quả hòa giải không có giá trị ràng buộc trừ khi các Bên ký xác nhận bằng văn bản.</w:t>
+      </w:r>
+    </w:p>
+    <w:p>
+      <w:pPr>
+        <w:pStyle w:val="Heading2"/>
+        <w:rPr>
+          <w:rFonts w:eastAsia="Times New Roman"/>
+        </w:rPr>
+      </w:pPr>
+      <w:r>
+        <w:rPr>
+          <w:rFonts w:eastAsia="Times New Roman"/>
+        </w:rPr>
+        <w:t>Trong thời gian thương lượng hoặc hòa giải, các Bên vẫn có nghĩa vụ thực hiện đầy đủ các nghĩa vụ của mình theo Hợp đồng, trừ khi có thỏa thuận khác bằng văn bản.</w:t>
+      </w:r>
+    </w:p>
+    <w:p>
+      <w:pPr>
+        <w:pStyle w:val="Heading1"/>
+        <w:rPr>
+          <w:rFonts w:eastAsia="Times New Roman"/>
+        </w:rPr>
+      </w:pPr>
+      <w:r>
+        <w:rPr>
+          <w:rFonts w:eastAsia="Times New Roman"/>
+        </w:rPr>
+        <w:t>Phạt Vi Phạm Hợp Đồng</w:t>
+      </w:r>
+    </w:p>
+    <w:p>
+      <w:pPr>
+        <w:pStyle w:val="Heading2"/>
+        <w:rPr>
+          <w:rFonts w:eastAsia="Times New Roman"/>
+        </w:rPr>
+      </w:pPr>
+      <w:r>
+        <w:rPr>
+          <w:rFonts w:eastAsia="Times New Roman"/>
+        </w:rPr>
+        <w:t>Trong trường hợp một Bên vi phạm bất kỳ nghĩa vụ cơ bản nào theo Hợp đồng này và không khắc phục vi phạm trong vòng 30 (ba mươi) ngày kể từ ngày nhận được thông báo bằng văn bản từ Bên kia, Bên vi phạm phải chịu phạt bằng 8% (tám phần trăm) giá trị phần nghĩa vụ bị vi phạm.</w:t>
+      </w:r>
+    </w:p>
+    <w:p>
+      <w:pPr>
+        <w:pStyle w:val="Heading2"/>
+        <w:rPr>
+          <w:rFonts w:eastAsia="Times New Roman"/>
+        </w:rPr>
+      </w:pPr>
+      <w:r>
+        <w:rPr>
+          <w:rFonts w:eastAsia="Times New Roman"/>
+        </w:rPr>
+        <w:t>Việc nộp phạt vi phạm không miễn trừ trách nhiệm bồi thường thiệt hại thực tế phát sinh theo quy định của pháp luật Việt Nam. Bên bị vi phạm có quyền yêu cầu bồi thường toàn bộ thiệt hại vượt quá mức phạt.</w:t>
+      </w:r>
     </w:p>
     <w:p>
       <w:pPr>
@@ -2656,39 +2525,22 @@
         <w:spacing w:after="0"/>
       </w:pPr>
       <w:r>
-        <w:t>Chi phí</w:t>
-      </w:r>
-    </w:p>
-    <w:p>
-      <w:pPr>
-        <w:rPr>
-          <w:lang w:val="en-GB" w:eastAsia="zh-TW"/>
-        </w:rPr>
-      </w:pPr>
-    </w:p>
+        <w:t xml:space="preserve">Toàn Bộ Thỏa Thuận </w:t>
+      </w:r>
+    </w:p>
+    <w:p/>
     <w:p>
       <w:pPr>
         <w:ind w:left="720"/>
         <w:jc w:val="both"/>
-        <w:rPr>
-          <w:szCs w:val="24"/>
-          <w:lang w:val="en-GB"/>
-        </w:rPr>
-      </w:pPr>
-      <w:r>
-        <w:rPr>
-          <w:szCs w:val="24"/>
-          <w:lang w:val="en-GB"/>
-        </w:rPr>
-        <w:t>Từng bên sẽ chịu các chi phí, chi tiêu của mình của hoặc có liên quan tới sự chuẩn bị, đàm phán, ký kết và thực hiện hợp đồng này và các tài liệu liên quan.</w:t>
-      </w:r>
-    </w:p>
-    <w:p>
-      <w:pPr>
-        <w:ind w:left="426" w:hanging="66"/>
-        <w:jc w:val="both"/>
-        <w:rPr>
-          <w:szCs w:val="24"/>
+      </w:pPr>
+      <w:r>
+        <w:t xml:space="preserve">Hợp đồng này (cùng với bất cứ văn bản nào dẫn chiếu tới trong hợp đồng này hoặc ký kết đồng thời bởi các bên liên quan tới hợp đồng này) sẽ tạo nên toàn bộ thoả thuận giữa các bên và thay thế mọi thoả thuận, thu xếp, ghi nhớ trước giữa các bên về các nội dung của hợp đồng này. </w:t>
+      </w:r>
+    </w:p>
+    <w:p>
+      <w:pPr>
+        <w:rPr>
           <w:lang w:val="en-GB"/>
         </w:rPr>
       </w:pPr>
@@ -2699,7 +2551,7 @@
         <w:spacing w:after="0"/>
       </w:pPr>
       <w:r>
-        <w:t>Chuyển nhượng</w:t>
+        <w:t xml:space="preserve">Sự thay đổi và quyền đền bù </w:t>
       </w:r>
     </w:p>
     <w:p>
@@ -2712,131 +2564,50 @@
     <w:p>
       <w:pPr>
         <w:pStyle w:val="Heading2"/>
-      </w:pPr>
-      <w:r>
-        <w:t xml:space="preserve">Ngoại trừ qui định khác đi, quyền lợi và nghĩa vụ theo hợp đồng này đối với từng bên trong hợp đồng là cho chính bản thân bên đó và sẽ không được chuyển nhượng, chuyển giao hoặc xử lý khác đi trừ khi có sự đồng ý bằng văn bản của bên kia; </w:t>
-      </w:r>
-    </w:p>
-    <w:p/>
+        <w:rPr>
+          <w:lang w:val="en-GB"/>
+        </w:rPr>
+      </w:pPr>
+      <w:r>
+        <w:rPr>
+          <w:lang w:val="en-GB"/>
+        </w:rPr>
+        <w:t>Không có sự thay đổi hay sửa đổi của hợp đồng này có hiệu lực trừ khi có văn bản ký bởi người đại diện uỷ quyền của các bên</w:t>
+      </w:r>
+    </w:p>
+    <w:p>
+      <w:pPr>
+        <w:jc w:val="both"/>
+        <w:rPr>
+          <w:szCs w:val="24"/>
+          <w:lang w:val="en-GB"/>
+        </w:rPr>
+      </w:pPr>
+      <w:r>
+        <w:rPr>
+          <w:szCs w:val="24"/>
+          <w:lang w:val="en-GB"/>
+        </w:rPr>
+        <w:t>.</w:t>
+      </w:r>
+    </w:p>
     <w:p>
       <w:pPr>
         <w:pStyle w:val="Heading2"/>
         <w:rPr>
-          <w:lang w:val="en-GB"/>
-        </w:rPr>
-      </w:pPr>
-      <w:r>
-        <w:rPr>
-          <w:lang w:val="en-GB"/>
-        </w:rPr>
-        <w:t xml:space="preserve">Các Bên thống nhất, khi một trong hai bên muốn chuyển nhượng phần vốn góp của mình trong Công Ty (“Bên Chuyển Nhượng”), Bên này trước tiên cần thông báo cho bên (hoặc các bên) Bên Không Chuyển Nhượng ý định của mình cùng giá cả và các điều kiện chuyển nhượng khác và cho phép bên không chuyển nhượng quyền ưu tiên được nhận chuyển nhượng phần vốn góp của mình so với bất kỳ một bên thứ ba nào khác. </w:t>
-      </w:r>
-    </w:p>
-    <w:p>
-      <w:pPr>
-        <w:ind w:left="720" w:hanging="720"/>
-        <w:rPr>
-          <w:lang w:val="en-GB"/>
-        </w:rPr>
-      </w:pPr>
-    </w:p>
-    <w:p>
-      <w:pPr>
-        <w:pStyle w:val="Heading1"/>
-        <w:rPr>
-          <w:rFonts w:eastAsia="Times New Roman"/>
-        </w:rPr>
-      </w:pPr>
-      <w:r>
-        <w:rPr>
-          <w:rFonts w:eastAsia="Times New Roman"/>
-        </w:rPr>
-        <w:t>Giải Quyết Tranh Chấp Nội Bộ</w:t>
-      </w:r>
-    </w:p>
-    <w:p>
-      <w:pPr>
-        <w:pStyle w:val="Heading2"/>
-        <w:rPr>
-          <w:rFonts w:eastAsia="Times New Roman"/>
-        </w:rPr>
-      </w:pPr>
-      <w:r>
-        <w:rPr>
-          <w:rFonts w:eastAsia="Times New Roman"/>
-        </w:rPr>
-        <w:t xml:space="preserve">Trước khi đưa bất kỳ tranh chấp nào ra trọng tài hoặc tòa án, các Bên có nghĩa vụ thương lượng thiện chí trong vòng 30 (ba mươi) ngày kể từ ngày một Bên gửi thông báo tranh chấp bằng văn bản cho Bên kia.</w:t>
-      </w:r>
-    </w:p>
-    <w:p>
-      <w:pPr>
-        <w:pStyle w:val="Heading2"/>
-        <w:rPr>
-          <w:rFonts w:eastAsia="Times New Roman"/>
-        </w:rPr>
-      </w:pPr>
-      <w:r>
-        <w:rPr>
-          <w:rFonts w:eastAsia="Times New Roman"/>
-        </w:rPr>
-        <w:t xml:space="preserve">Nếu không đạt được thỏa thuận sau 30 ngày thương lượng, các Bên có thể yêu cầu chỉ định một chuyên gia hòa giải độc lập được cả hai Bên chấp thuận. Chi phí hòa giải được chia đều giữa các Bên. Kết quả hòa giải không có giá trị ràng buộc trừ khi các Bên ký xác nhận bằng văn bản.</w:t>
-      </w:r>
-    </w:p>
-    <w:p>
-      <w:pPr>
-        <w:pStyle w:val="Heading2"/>
-        <w:rPr>
-          <w:rFonts w:eastAsia="Times New Roman"/>
-        </w:rPr>
-      </w:pPr>
-      <w:r>
-        <w:rPr>
-          <w:rFonts w:eastAsia="Times New Roman"/>
-        </w:rPr>
-        <w:t xml:space="preserve">Trong thời gian thương lượng hoặc hòa giải, các Bên vẫn có nghĩa vụ thực hiện đầy đủ các nghĩa vụ của mình theo Hợp đồng, trừ khi có thỏa thuận khác bằng văn bản.</w:t>
-      </w:r>
-    </w:p>
-    <w:p>
-      <w:pPr>
-        <w:pStyle w:val="Heading1"/>
-        <w:rPr>
-          <w:rFonts w:eastAsia="Times New Roman"/>
-        </w:rPr>
-      </w:pPr>
-      <w:r>
-        <w:rPr>
-          <w:rFonts w:eastAsia="Times New Roman"/>
-        </w:rPr>
-        <w:t>Phạt Vi Phạm Hợp Đồng</w:t>
-      </w:r>
-    </w:p>
-    <w:p>
-      <w:pPr>
-        <w:pStyle w:val="Heading2"/>
-        <w:rPr>
-          <w:rFonts w:eastAsia="Times New Roman"/>
-        </w:rPr>
-      </w:pPr>
-      <w:r>
-        <w:rPr>
-          <w:rFonts w:eastAsia="Times New Roman"/>
-        </w:rPr>
-        <w:t xml:space="preserve">Trong trường hợp một Bên vi phạm bất kỳ nghĩa vụ cơ bản nào theo Hợp đồng này và không khắc phục vi phạm trong vòng 30 (ba mươi) ngày kể từ ngày nhận được thông báo bằng văn bản từ Bên kia, Bên vi phạm phải chịu phạt bằng 8% (tám phần trăm) giá trị phần nghĩa vụ bị vi phạm.</w:t>
-      </w:r>
-    </w:p>
-    <w:p>
-      <w:pPr>
-        <w:pStyle w:val="Heading2"/>
-        <w:rPr>
-          <w:rFonts w:eastAsia="Times New Roman"/>
-        </w:rPr>
-      </w:pPr>
-      <w:r>
-        <w:rPr>
-          <w:rFonts w:eastAsia="Times New Roman"/>
-        </w:rPr>
-        <w:t xml:space="preserve">Việc nộp phạt vi phạm không miễn trừ trách nhiệm bồi thường thiệt hại thực tế phát sinh theo quy định của pháp luật Việt Nam. Bên bị vi phạm có quyền yêu cầu bồi thường toàn bộ thiệt hại vượt quá mức phạt.</w:t>
-      </w:r>
+          <w:lang w:val="en-GB" w:eastAsia="zh-TW"/>
+        </w:rPr>
+      </w:pPr>
+      <w:r>
+        <w:t>Công ty có thể vào bất cứ thời điểm nào khấu trừ bất cứ một khoản nào mà Một Bên đang nợ và có nghĩa vụ phải trả cho Công Ty vào bất kỳ một khoản phải trả và đã đến hạn của Bên đó theo hợp đồng này. Tuy nhiên Công ty không có nghĩa vụ phải thực hiện quyền khấu trừ như qui định trong điều khoản này</w:t>
+      </w:r>
+    </w:p>
+    <w:p>
+      <w:pPr>
+        <w:rPr>
+          <w:lang w:val="en-GB" w:eastAsia="zh-TW"/>
+        </w:rPr>
+      </w:pPr>
     </w:p>
     <w:p>
       <w:pPr>
@@ -2844,23 +2615,361 @@
         <w:spacing w:after="0"/>
       </w:pPr>
       <w:r>
-        <w:t xml:space="preserve">Toàn Bộ Thỏa Thuận </w:t>
-      </w:r>
-    </w:p>
-    <w:p/>
+        <w:t>Thông báo và các phương pháp thông báo</w:t>
+      </w:r>
+    </w:p>
+    <w:p>
+      <w:pPr>
+        <w:rPr>
+          <w:lang w:val="en-GB" w:eastAsia="zh-TW"/>
+        </w:rPr>
+      </w:pPr>
+    </w:p>
+    <w:p>
+      <w:pPr>
+        <w:pStyle w:val="Heading2"/>
+        <w:rPr>
+          <w:lang w:val="en-GB"/>
+        </w:rPr>
+      </w:pPr>
+      <w:r>
+        <w:rPr>
+          <w:lang w:val="en-GB"/>
+        </w:rPr>
+        <w:t>Mọi thông báo gửi cho bất cứ bên nào sẽ được coi là hợp lệ thông qua việc gửi trao tay, qua thư đăng ký trả trước của bưu điện (bằng máy bay nếu tới địa chỉ nước ngoài) hoặc bằng fax tới địa chỉ của bên đó dưới đây hoặc số fax được cung cấp tại điều khoản này hoặc địa chỉ khác hoặc số fax khác có thể được thông báo tùy từng thời điểm vì mục đích này.</w:t>
+      </w:r>
+    </w:p>
+    <w:p>
+      <w:pPr>
+        <w:rPr>
+          <w:szCs w:val="24"/>
+          <w:lang w:val="en-GB"/>
+        </w:rPr>
+      </w:pPr>
+    </w:p>
+    <w:p>
+      <w:pPr>
+        <w:pStyle w:val="Heading2"/>
+      </w:pPr>
+      <w:r>
+        <w:t>Nếu việc chuyển và nhận xảy ra vào ngày khi việc kinh doanh nói chung không được tiến hành tại nơi mà thông báo được gửi tới hoặc xảy ra muộn hơn 17:00 giờ chiều (giờ địa phương tại nơi nhận) thì sẽ được thực hiện để giao vào 09:00</w:t>
+      </w:r>
+      <w:r>
+        <w:rPr>
+          <w:rStyle w:val="normalchar1"/>
+        </w:rPr>
+        <w:t xml:space="preserve"> giờ </w:t>
+      </w:r>
+      <w:r>
+        <w:t>sáng ngày hôm sau khi việc kinh doanh được tiến hành tại địa điểm đó.</w:t>
+      </w:r>
+    </w:p>
     <w:p>
       <w:pPr>
         <w:ind w:left="720"/>
         <w:jc w:val="both"/>
-      </w:pPr>
-      <w:r>
-        <w:t xml:space="preserve">Hợp đồng này (cùng với bất cứ văn bản nào dẫn chiếu tới trong hợp đồng này hoặc ký kết đồng thời bởi các bên liên quan tới hợp đồng này) sẽ tạo nên toàn bộ thoả thuận giữa các bên và thay thế mọi thoả thuận, thu xếp, ghi nhớ trước giữa các bên về các nội dung của hợp đồng này. </w:t>
-      </w:r>
-    </w:p>
-    <w:p>
-      <w:pPr>
-        <w:rPr>
-          <w:lang w:val="en-GB"/>
+        <w:rPr>
+          <w:szCs w:val="24"/>
+          <w:u w:val="single"/>
+          <w:lang w:val="en-GB"/>
+        </w:rPr>
+      </w:pPr>
+    </w:p>
+    <w:p>
+      <w:pPr>
+        <w:ind w:left="720"/>
+        <w:jc w:val="both"/>
+        <w:rPr>
+          <w:szCs w:val="24"/>
+          <w:u w:val="single"/>
+          <w:lang w:val="en-GB"/>
+        </w:rPr>
+      </w:pPr>
+      <w:r>
+        <w:rPr>
+          <w:szCs w:val="24"/>
+          <w:u w:val="single"/>
+          <w:lang w:val="en-GB"/>
+        </w:rPr>
+        <w:t>Gửi Bên A</w:t>
+      </w:r>
+    </w:p>
+    <w:p>
+      <w:pPr>
+        <w:rPr>
+          <w:szCs w:val="24"/>
+          <w:u w:val="single"/>
+          <w:lang w:val="en-GB"/>
+        </w:rPr>
+      </w:pPr>
+    </w:p>
+    <w:p>
+      <w:pPr>
+        <w:ind w:left="720"/>
+        <w:rPr>
+          <w:b/>
+          <w:bCs/>
+          <w:szCs w:val="24"/>
+        </w:rPr>
+      </w:pPr>
+      <w:r>
+        <w:rPr>
+          <w:szCs w:val="24"/>
+          <w:lang w:val="en-GB"/>
+        </w:rPr>
+        <w:t>Địa chỉ:</w:t>
+      </w:r>
+      <w:r>
+        <w:rPr>
+          <w:szCs w:val="24"/>
+          <w:lang w:val="en-GB"/>
+        </w:rPr>
+        <w:tab/>
+      </w:r>
+      <w:r>
+        <w:rPr>
+          <w:szCs w:val="24"/>
+          <w:lang w:val="en-GB"/>
+        </w:rPr>
+        <w:tab/>
+      </w:r>
+      <w:r>
+        <w:rPr>
+          <w:szCs w:val="24"/>
+        </w:rPr>
+        <w:t>12 Trần Phú, phường Lộc Thọ, thành phố Nha Trang, tỉnh Khánh Hòa, Việt Nam</w:t>
+      </w:r>
+    </w:p>
+    <w:p>
+      <w:pPr>
+        <w:tabs>
+          <w:tab w:val="left" w:pos="2880"/>
+        </w:tabs>
+        <w:ind w:left="720"/>
+        <w:jc w:val="both"/>
+        <w:rPr>
+          <w:szCs w:val="24"/>
+        </w:rPr>
+      </w:pPr>
+      <w:r>
+        <w:rPr>
+          <w:szCs w:val="24"/>
+          <w:lang w:val="en-GB"/>
+        </w:rPr>
+        <w:t>Số fax:</w:t>
+      </w:r>
+      <w:r>
+        <w:rPr>
+          <w:szCs w:val="24"/>
+          <w:lang w:val="en-GB"/>
+        </w:rPr>
+        <w:tab/>
+      </w:r>
+      <w:r>
+        <w:rPr>
+          <w:szCs w:val="24"/>
+        </w:rPr>
+        <w:t>(+84) 258 3823456</w:t>
+      </w:r>
+    </w:p>
+    <w:p>
+      <w:pPr>
+        <w:ind w:left="720"/>
+        <w:jc w:val="both"/>
+        <w:rPr>
+          <w:rStyle w:val="normalchar1"/>
+        </w:rPr>
+      </w:pPr>
+      <w:r>
+        <w:rPr>
+          <w:szCs w:val="24"/>
+          <w:lang w:val="en-GB"/>
+        </w:rPr>
+        <w:t>Gửi cho:</w:t>
+      </w:r>
+      <w:r>
+        <w:rPr>
+          <w:szCs w:val="24"/>
+          <w:lang w:val="en-GB"/>
+        </w:rPr>
+        <w:tab/>
+      </w:r>
+      <w:r>
+        <w:rPr>
+          <w:szCs w:val="24"/>
+          <w:lang w:val="en-GB"/>
+        </w:rPr>
+        <w:tab/>
+      </w:r>
+      <w:r>
+        <w:rPr>
+          <w:szCs w:val="24"/>
+        </w:rPr>
+        <w:t>Ông Nguyễn Văn Hưng – Tổng Giám đốc</w:t>
+      </w:r>
+    </w:p>
+    <w:p>
+      <w:pPr>
+        <w:ind w:left="720"/>
+        <w:jc w:val="both"/>
+        <w:rPr>
+          <w:szCs w:val="24"/>
+          <w:lang w:val="en-GB" w:eastAsia="zh-TW"/>
+        </w:rPr>
+      </w:pPr>
+    </w:p>
+    <w:p>
+      <w:pPr>
+        <w:tabs>
+          <w:tab w:val="left" w:pos="2970"/>
+        </w:tabs>
+        <w:ind w:left="720"/>
+        <w:jc w:val="both"/>
+        <w:rPr>
+          <w:szCs w:val="24"/>
+          <w:u w:val="single"/>
+          <w:lang w:val="en-GB"/>
+        </w:rPr>
+      </w:pPr>
+      <w:r>
+        <w:rPr>
+          <w:szCs w:val="24"/>
+          <w:u w:val="single"/>
+          <w:lang w:val="en-GB"/>
+        </w:rPr>
+        <w:t>Gửi Bên B</w:t>
+      </w:r>
+    </w:p>
+    <w:p>
+      <w:pPr>
+        <w:ind w:left="720"/>
+        <w:jc w:val="both"/>
+        <w:rPr>
+          <w:szCs w:val="24"/>
+          <w:u w:val="single"/>
+          <w:lang w:val="en-GB"/>
+        </w:rPr>
+      </w:pPr>
+    </w:p>
+    <w:p>
+      <w:pPr>
+        <w:tabs>
+          <w:tab w:val="left" w:pos="2880"/>
+        </w:tabs>
+        <w:ind w:left="720"/>
+        <w:jc w:val="both"/>
+        <w:rPr>
+          <w:rStyle w:val="normalchar1"/>
+        </w:rPr>
+      </w:pPr>
+      <w:r>
+        <w:rPr>
+          <w:szCs w:val="24"/>
+          <w:lang w:val="en-GB"/>
+        </w:rPr>
+        <w:t>Địa chỉ</w:t>
+      </w:r>
+      <w:r>
+        <w:rPr>
+          <w:szCs w:val="24"/>
+          <w:lang w:val="en-GB"/>
+        </w:rPr>
+        <w:tab/>
+      </w:r>
+      <w:r>
+        <w:rPr>
+          <w:szCs w:val="24"/>
+        </w:rPr>
+        <w:t>10 Marina Boulevard, Marina Bay Financial Centre, Singapore</w:t>
+      </w:r>
+    </w:p>
+    <w:p>
+      <w:pPr>
+        <w:ind w:left="720"/>
+        <w:jc w:val="both"/>
+        <w:rPr>
+          <w:szCs w:val="24"/>
+          <w:lang w:val="nl-NL"/>
+        </w:rPr>
+      </w:pPr>
+      <w:r>
+        <w:rPr>
+          <w:szCs w:val="24"/>
+          <w:lang w:val="nl-NL"/>
+        </w:rPr>
+        <w:t>Số fax</w:t>
+      </w:r>
+      <w:r>
+        <w:rPr>
+          <w:szCs w:val="24"/>
+          <w:lang w:val="nl-NL"/>
+        </w:rPr>
+        <w:tab/>
+        <w:t>:</w:t>
+      </w:r>
+      <w:r>
+        <w:rPr>
+          <w:szCs w:val="24"/>
+          <w:lang w:val="nl-NL"/>
+        </w:rPr>
+        <w:tab/>
+      </w:r>
+      <w:r>
+        <w:rPr>
+          <w:szCs w:val="24"/>
+          <w:lang w:val="nl-NL"/>
+        </w:rPr>
+        <w:tab/>
+      </w:r>
+      <w:r>
+        <w:rPr>
+          <w:szCs w:val="24"/>
+        </w:rPr>
+        <w:t>(+65) 6223 4567</w:t>
+      </w:r>
+    </w:p>
+    <w:p>
+      <w:pPr>
+        <w:ind w:left="720"/>
+        <w:jc w:val="both"/>
+        <w:rPr>
+          <w:szCs w:val="24"/>
+          <w:lang w:val="nl-NL" w:eastAsia="zh-TW"/>
+        </w:rPr>
+      </w:pPr>
+      <w:r>
+        <w:rPr>
+          <w:szCs w:val="24"/>
+          <w:lang w:val="nl-NL"/>
+        </w:rPr>
+        <w:t>Người nhận:</w:t>
+      </w:r>
+      <w:r>
+        <w:rPr>
+          <w:szCs w:val="24"/>
+          <w:lang w:val="nl-NL"/>
+        </w:rPr>
+        <w:tab/>
+      </w:r>
+      <w:r>
+        <w:rPr>
+          <w:szCs w:val="24"/>
+          <w:lang w:val="nl-NL"/>
+        </w:rPr>
+        <w:tab/>
+      </w:r>
+      <w:r>
+        <w:rPr>
+          <w:szCs w:val="24"/>
+        </w:rPr>
+        <w:t>Ông David Lim Wei Jian – Giám đốc</w:t>
+      </w:r>
+    </w:p>
+    <w:p>
+      <w:pPr>
+        <w:rPr>
+          <w:szCs w:val="24"/>
+          <w:lang w:val="nl-NL"/>
         </w:rPr>
       </w:pPr>
     </w:p>
@@ -2870,61 +2979,43 @@
         <w:spacing w:after="0"/>
       </w:pPr>
       <w:r>
-        <w:t xml:space="preserve">Sự thay đổi và quyền đền bù </w:t>
-      </w:r>
-    </w:p>
-    <w:p>
-      <w:pPr>
-        <w:rPr>
-          <w:lang w:val="en-GB" w:eastAsia="zh-TW"/>
-        </w:rPr>
-      </w:pPr>
-    </w:p>
-    <w:p>
-      <w:pPr>
-        <w:pStyle w:val="Heading2"/>
-        <w:rPr>
-          <w:lang w:val="en-GB"/>
-        </w:rPr>
-      </w:pPr>
-      <w:r>
-        <w:rPr>
-          <w:lang w:val="en-GB"/>
-        </w:rPr>
-        <w:t>Không có sự thay đổi hay sửa đổi của hợp đồng này có hiệu lực trừ khi có văn bản ký bởi người đại diện uỷ quyền của các bên</w:t>
-      </w:r>
-    </w:p>
-    <w:p>
-      <w:pPr>
-        <w:jc w:val="both"/>
-        <w:rPr>
-          <w:szCs w:val="24"/>
-          <w:lang w:val="en-GB"/>
-        </w:rPr>
-      </w:pPr>
-      <w:r>
-        <w:rPr>
-          <w:szCs w:val="24"/>
-          <w:lang w:val="en-GB"/>
-        </w:rPr>
-        <w:t>.</w:t>
-      </w:r>
-    </w:p>
-    <w:p>
-      <w:pPr>
-        <w:pStyle w:val="Heading2"/>
-        <w:rPr>
-          <w:lang w:val="en-GB" w:eastAsia="zh-TW"/>
-        </w:rPr>
-      </w:pPr>
-      <w:r>
-        <w:t>Công ty có thể vào bất cứ thời điểm nào khấu trừ bất cứ một khoản nào mà Một Bên đang nợ và có nghĩa vụ phải trả cho Công Ty vào bất kỳ một khoản phải trả và đã đến hạn của Bên đó theo hợp đồng này. Tuy nhiên Công ty không có nghĩa vụ phải thực hiện quyền khấu trừ như qui định trong điều khoản này</w:t>
-      </w:r>
-    </w:p>
-    <w:p>
-      <w:pPr>
-        <w:rPr>
-          <w:lang w:val="en-GB" w:eastAsia="zh-TW"/>
+        <w:t>Sự khước từ</w:t>
+      </w:r>
+    </w:p>
+    <w:p>
+      <w:pPr>
+        <w:ind w:left="567"/>
+        <w:jc w:val="both"/>
+        <w:rPr>
+          <w:szCs w:val="24"/>
+          <w:lang w:val="nl-NL"/>
+        </w:rPr>
+      </w:pPr>
+    </w:p>
+    <w:p>
+      <w:pPr>
+        <w:ind w:left="720"/>
+        <w:jc w:val="both"/>
+        <w:rPr>
+          <w:szCs w:val="24"/>
+          <w:lang w:val="nl-NL"/>
+        </w:rPr>
+      </w:pPr>
+      <w:r>
+        <w:rPr>
+          <w:szCs w:val="24"/>
+          <w:lang w:val="nl-NL"/>
+        </w:rPr>
+        <w:t>Sự không thực hiện hoặc trì hoãn thực hiện bất cứ quyền, thẩm quyền, khắc phục của bất cứ bên nào theo hợp đồng này sẽ không tạo nên sự từ bỏ, từ chối hay khước từ thực hiện theo đó, sự thực hiện đơn lẻ hay một phần việc như vậy sẽ không ngăn chặn bất cứ thực hiện những việc này sau đó hoặc của việc thực hiện bất cứ quyền nào, thẩm quyền hay sự khắc phục nào. Không giới hạn ở qui định trên, không sự từ bỏ từ chối hay khước từ thực hiện bởi bất cứ bên nào bất cứ vi phạm qui định nào trong hợp đồng này sẽ được coi là một sự từ bỏ đối với bất cứ vi phạm sau đó qui định đó hoặc bất cứ qui định nào khác trong hợp đồng này</w:t>
+      </w:r>
+    </w:p>
+    <w:p>
+      <w:pPr>
+        <w:ind w:left="567"/>
+        <w:jc w:val="both"/>
+        <w:rPr>
+          <w:szCs w:val="24"/>
+          <w:lang w:val="nl-NL"/>
         </w:rPr>
       </w:pPr>
     </w:p>
@@ -2934,53 +3025,7 @@
         <w:spacing w:after="0"/>
       </w:pPr>
       <w:r>
-        <w:t>Thông báo và các phương pháp thông báo</w:t>
-      </w:r>
-    </w:p>
-    <w:p>
-      <w:pPr>
-        <w:rPr>
-          <w:lang w:val="en-GB" w:eastAsia="zh-TW"/>
-        </w:rPr>
-      </w:pPr>
-    </w:p>
-    <w:p>
-      <w:pPr>
-        <w:pStyle w:val="Heading2"/>
-        <w:rPr>
-          <w:lang w:val="en-GB"/>
-        </w:rPr>
-      </w:pPr>
-      <w:r>
-        <w:rPr>
-          <w:lang w:val="en-GB"/>
-        </w:rPr>
-        <w:t>Mọi thông báo gửi cho bất cứ bên nào sẽ được coi là hợp lệ thông qua việc gửi trao tay, qua thư đăng ký trả trước của bưu điện (bằng máy bay nếu tới địa chỉ nước ngoài) hoặc bằng fax tới địa chỉ của bên đó dưới đây hoặc số fax được cung cấp tại điều khoản này hoặc địa chỉ khác hoặc số fax khác có thể được thông báo tùy từng thời điểm vì mục đích này.</w:t>
-      </w:r>
-    </w:p>
-    <w:p>
-      <w:pPr>
-        <w:rPr>
-          <w:szCs w:val="24"/>
-          <w:lang w:val="en-GB"/>
-        </w:rPr>
-      </w:pPr>
-    </w:p>
-    <w:p>
-      <w:pPr>
-        <w:pStyle w:val="Heading2"/>
-      </w:pPr>
-      <w:r>
-        <w:t>Nếu việc chuyển và nhận xảy ra vào ngày khi việc kinh doanh nói chung không được tiến hành tại nơi mà thông báo được gửi tới hoặc xảy ra muộn hơn 17:00 giờ chiều (giờ địa phương tại nơi nhận) thì sẽ được thực hiện để giao vào 09:00</w:t>
-      </w:r>
-      <w:r>
-        <w:rPr>
-          <w:rStyle w:val="normalchar1"/>
-        </w:rPr>
-        <w:t xml:space="preserve"> giờ </w:t>
-      </w:r>
-      <w:r>
-        <w:t>sáng ngày hôm sau khi việc kinh doanh được tiến hành tại địa điểm đó.</w:t>
+        <w:t>Sự tách biệt</w:t>
       </w:r>
     </w:p>
     <w:p>
@@ -2989,8 +3034,7 @@
         <w:jc w:val="both"/>
         <w:rPr>
           <w:szCs w:val="24"/>
-          <w:u w:val="single"/>
-          <w:lang w:val="en-GB"/>
+          <w:lang w:val="nl-NL"/>
         </w:rPr>
       </w:pPr>
     </w:p>
@@ -3000,178 +3044,6 @@
         <w:jc w:val="both"/>
         <w:rPr>
           <w:szCs w:val="24"/>
-          <w:u w:val="single"/>
-          <w:lang w:val="en-GB"/>
-        </w:rPr>
-      </w:pPr>
-      <w:r>
-        <w:rPr>
-          <w:szCs w:val="24"/>
-          <w:u w:val="single"/>
-          <w:lang w:val="en-GB"/>
-        </w:rPr>
-        <w:t>Gửi Bên A</w:t>
-      </w:r>
-    </w:p>
-    <w:p>
-      <w:pPr>
-        <w:rPr>
-          <w:szCs w:val="24"/>
-          <w:u w:val="single"/>
-          <w:lang w:val="en-GB"/>
-        </w:rPr>
-      </w:pPr>
-    </w:p>
-    <w:p>
-      <w:pPr>
-        <w:ind w:left="720"/>
-        <w:rPr>
-          <w:b/>
-          <w:bCs/>
-          <w:szCs w:val="24"/>
-        </w:rPr>
-      </w:pPr>
-      <w:r>
-        <w:rPr>
-          <w:szCs w:val="24"/>
-          <w:lang w:val="en-GB"/>
-        </w:rPr>
-        <w:t>Địa chỉ:</w:t>
-        <w:tab/>
-        <w:tab/>
-      </w:r>
-      <w:r>
-        <w:rPr>
-          <w:szCs w:val="24"/>
-        </w:rPr>
-        <w:t>12 Trần Phú, phường Lộc Thọ, thành phố Nha Trang, tỉnh Khánh Hòa, Việt Nam</w:t>
-      </w:r>
-    </w:p>
-    <w:p>
-      <w:pPr>
-        <w:tabs>
-          <w:tab w:val="left" w:pos="2880"/>
-        </w:tabs>
-        <w:ind w:left="720"/>
-        <w:jc w:val="both"/>
-        <w:rPr>
-          <w:szCs w:val="24"/>
-        </w:rPr>
-      </w:pPr>
-      <w:r>
-        <w:rPr>
-          <w:szCs w:val="24"/>
-          <w:lang w:val="en-GB"/>
-        </w:rPr>
-        <w:t>Số fax:</w:t>
-        <w:tab/>
-      </w:r>
-      <w:r>
-        <w:rPr>
-          <w:szCs w:val="24"/>
-        </w:rPr>
-        <w:t>(+84) 258 3823456</w:t>
-      </w:r>
-    </w:p>
-    <w:p>
-      <w:pPr>
-        <w:ind w:left="720"/>
-        <w:jc w:val="both"/>
-        <w:rPr>
-          <w:rStyle w:val="normalchar1"/>
-        </w:rPr>
-      </w:pPr>
-      <w:r>
-        <w:rPr>
-          <w:szCs w:val="24"/>
-          <w:lang w:val="en-GB"/>
-        </w:rPr>
-        <w:t>Gửi cho:</w:t>
-        <w:tab/>
-        <w:tab/>
-      </w:r>
-      <w:r>
-        <w:rPr>
-          <w:szCs w:val="24"/>
-        </w:rPr>
-        <w:t>Ông Nguyễn Văn Hưng – Tổng Giám đốc</w:t>
-      </w:r>
-    </w:p>
-    <w:p>
-      <w:pPr>
-        <w:ind w:left="720"/>
-        <w:jc w:val="both"/>
-        <w:rPr>
-          <w:szCs w:val="24"/>
-          <w:lang w:val="en-GB" w:eastAsia="zh-TW"/>
-        </w:rPr>
-      </w:pPr>
-    </w:p>
-    <w:p>
-      <w:pPr>
-        <w:tabs>
-          <w:tab w:val="left" w:pos="2970"/>
-        </w:tabs>
-        <w:ind w:left="720"/>
-        <w:jc w:val="both"/>
-        <w:rPr>
-          <w:szCs w:val="24"/>
-          <w:u w:val="single"/>
-          <w:lang w:val="en-GB"/>
-        </w:rPr>
-      </w:pPr>
-      <w:r>
-        <w:rPr>
-          <w:szCs w:val="24"/>
-          <w:u w:val="single"/>
-          <w:lang w:val="en-GB"/>
-        </w:rPr>
-        <w:t>Gửi Bên B</w:t>
-      </w:r>
-    </w:p>
-    <w:p>
-      <w:pPr>
-        <w:ind w:left="720"/>
-        <w:jc w:val="both"/>
-        <w:rPr>
-          <w:szCs w:val="24"/>
-          <w:u w:val="single"/>
-          <w:lang w:val="en-GB"/>
-        </w:rPr>
-      </w:pPr>
-    </w:p>
-    <w:p>
-      <w:pPr>
-        <w:tabs>
-          <w:tab w:val="left" w:pos="2880"/>
-        </w:tabs>
-        <w:ind w:left="720"/>
-        <w:jc w:val="both"/>
-        <w:rPr>
-          <w:rStyle w:val="normalchar1"/>
-        </w:rPr>
-      </w:pPr>
-      <w:r>
-        <w:rPr>
-          <w:szCs w:val="24"/>
-          <w:lang w:val="en-GB"/>
-        </w:rPr>
-        <w:t>Địa chỉ</w:t>
-        <w:tab/>
-      </w:r>
-      <w:r>
-        <w:rPr>
-          <w:szCs w:val="24"/>
-        </w:rPr>
-        <w:t>10 Marina Boulevard, Marina Bay Financial Centre, Singapore</w:t>
-      </w:r>
-    </w:p>
-    <w:p>
-      <w:pPr>
-        <w:ind w:left="720"/>
-        <w:jc w:val="both"/>
-        <w:rPr>
-          <w:szCs w:val="24"/>
           <w:lang w:val="nl-NL"/>
         </w:rPr>
       </w:pPr>
@@ -3180,132 +3052,15 @@
           <w:szCs w:val="24"/>
           <w:lang w:val="nl-NL"/>
         </w:rPr>
-        <w:t>Số fax</w:t>
-        <w:tab/>
-        <w:t>:</w:t>
-        <w:tab/>
-        <w:tab/>
-      </w:r>
-      <w:r>
-        <w:rPr>
-          <w:szCs w:val="24"/>
-        </w:rPr>
-        <w:t>(+65) 6223 4567</w:t>
-      </w:r>
-    </w:p>
-    <w:p>
-      <w:pPr>
-        <w:ind w:left="720"/>
-        <w:jc w:val="both"/>
-        <w:rPr>
-          <w:szCs w:val="24"/>
-          <w:lang w:val="nl-NL" w:eastAsia="zh-TW"/>
-        </w:rPr>
-      </w:pPr>
+        <w:t xml:space="preserve">Nếu bất cứ qui định nào hoặc phần nào của một qui định của hợp đồng này hoặc việc áp dụng nó đối với bất cứ bên nào, sẽ hoặc thấy bởi bất cứ cơ quan có thẩm quyền xét </w:t>
+      </w:r>
       <w:r>
         <w:rPr>
           <w:szCs w:val="24"/>
           <w:lang w:val="nl-NL"/>
         </w:rPr>
-        <w:t>Người nhận:</w:t>
-        <w:tab/>
-        <w:tab/>
-      </w:r>
-      <w:r>
-        <w:rPr>
-          <w:szCs w:val="24"/>
-        </w:rPr>
-        <w:t>Ông David Lim Wei Jian – Giám đốc</w:t>
-      </w:r>
-    </w:p>
-    <w:p>
-      <w:pPr>
-        <w:rPr>
-          <w:szCs w:val="24"/>
-          <w:lang w:val="nl-NL"/>
-        </w:rPr>
-      </w:pPr>
-    </w:p>
-    <w:p>
-      <w:pPr>
-        <w:pStyle w:val="Heading1"/>
-        <w:spacing w:after="0"/>
-      </w:pPr>
-      <w:r>
-        <w:t>Sự khước từ</w:t>
-      </w:r>
-    </w:p>
-    <w:p>
-      <w:pPr>
-        <w:ind w:left="567"/>
-        <w:jc w:val="both"/>
-        <w:rPr>
-          <w:szCs w:val="24"/>
-          <w:lang w:val="nl-NL"/>
-        </w:rPr>
-      </w:pPr>
-    </w:p>
-    <w:p>
-      <w:pPr>
-        <w:ind w:left="720"/>
-        <w:jc w:val="both"/>
-        <w:rPr>
-          <w:szCs w:val="24"/>
-          <w:lang w:val="nl-NL"/>
-        </w:rPr>
-      </w:pPr>
-      <w:r>
-        <w:rPr>
-          <w:szCs w:val="24"/>
-          <w:lang w:val="nl-NL"/>
-        </w:rPr>
-        <w:t>Sự không thực hiện hoặc trì hoãn thực hiện bất cứ quyền, thẩm quyền, khắc phục của bất cứ bên nào theo hợp đồng này sẽ không tạo nên sự từ bỏ, từ chối hay khước từ thực hiện theo đó, sự thực hiện đơn lẻ hay một phần việc như vậy sẽ không ngăn chặn bất cứ thực hiện những việc này sau đó hoặc của việc thực hiện bất cứ quyền nào, thẩm quyền hay sự khắc phục nào. Không giới hạn ở qui định trên, không sự từ bỏ từ chối hay khước từ thực hiện bởi bất cứ bên nào bất cứ vi phạm qui định nào trong hợp đồng này sẽ được coi là một sự từ bỏ đối với bất cứ vi phạm sau đó qui định đó hoặc bất cứ qui định nào khác trong hợp đồng này</w:t>
-      </w:r>
-    </w:p>
-    <w:p>
-      <w:pPr>
-        <w:ind w:left="567"/>
-        <w:jc w:val="both"/>
-        <w:rPr>
-          <w:szCs w:val="24"/>
-          <w:lang w:val="nl-NL"/>
-        </w:rPr>
-      </w:pPr>
-    </w:p>
-    <w:p>
-      <w:pPr>
-        <w:pStyle w:val="Heading1"/>
-        <w:spacing w:after="0"/>
-      </w:pPr>
-      <w:r>
-        <w:t>Sự tách biệt</w:t>
-      </w:r>
-    </w:p>
-    <w:p>
-      <w:pPr>
-        <w:ind w:left="720"/>
-        <w:jc w:val="both"/>
-        <w:rPr>
-          <w:szCs w:val="24"/>
-          <w:lang w:val="nl-NL"/>
-        </w:rPr>
-      </w:pPr>
-    </w:p>
-    <w:p>
-      <w:pPr>
-        <w:ind w:left="720"/>
-        <w:jc w:val="both"/>
-        <w:rPr>
-          <w:szCs w:val="24"/>
-          <w:lang w:val="nl-NL"/>
-        </w:rPr>
-      </w:pPr>
-      <w:r>
-        <w:rPr>
-          <w:szCs w:val="24"/>
-          <w:lang w:val="nl-NL"/>
-        </w:rPr>
-        <w:t xml:space="preserve">Nếu bất cứ qui định nào hoặc phần nào của một qui định của hợp đồng này hoặc việc áp dụng nó đối với bất cứ bên nào, sẽ hoặc thấy bởi bất cứ cơ quan có thẩm quyền xét xử nào rằng không có hiệu lực, không thể thực thi thì điều đó không ảnh hưởng tới các điều khoản khác hoặc các phần khác của qui định đó của hợp đồng này, tất cả các qui định đó đều có hiệu lực hoàn toàn và đầy đủ </w:t>
+        <w:lastRenderedPageBreak/>
+        <w:t xml:space="preserve">xử nào rằng không có hiệu lực, không thể thực thi thì điều đó không ảnh hưởng tới các điều khoản khác hoặc các phần khác của qui định đó của hợp đồng này, tất cả các qui định đó đều có hiệu lực hoàn toàn và đầy đủ </w:t>
       </w:r>
     </w:p>
     <w:p>
@@ -4871,6 +4626,7 @@
   <w:style w:type="character" w:default="1" w:styleId="DefaultParagraphFont">
     <w:name w:val="Default Paragraph Font"/>
     <w:uiPriority w:val="1"/>
+    <w:semiHidden/>
     <w:unhideWhenUsed/>
   </w:style>
   <w:style w:type="table" w:default="1" w:styleId="TableNormal">

</xml_diff>